<commit_message>
Document Slices 5 and 6a, integrity fixes and the UI design system
- PROJECT_SPEC.md: notes at the programmes and immigration_rules tables and
  a new Section 21 Decision Log (Option A, Slice 6a, integrity fixes, UI).
- New architecture/learning docs for Slice 5, Slice 6a and the UI system;
  dated update notes appended to Slice 2 and Slice 4 docs.
- SRS, Product Backlog and User Flow .docx files get appended v0.2/v0.3
  update sections; existing content is unchanged.

Co-Authored-By: Claude Opus 5.5 <noreply@anthropic.com>
</commit_message>
<xml_diff>
--- a/documents/Product_Backlog.docx
+++ b/documents/Product_Backlog.docx
@@ -8625,6 +8625,1253 @@
         <w:t xml:space="preserve">Một story không được coi là Done chỉ vì code chạy được. Theo Master Spec Section 17, cần đủ: type safety, validation, error handling, loading state, empty state, UI hợp lý, database migration, RLS khi áp dụng, test cho logic trọng yếu, không rò rỉ secret, tài liệu hoá khi kiến trúc thay đổi, và trích dẫn nguồn nếu story hiển thị fact bên ngoài.</w:t>
       </w:r>
     </w:p>
+    <w:p>
+      <w:pPr>
+        <w:pStyle w:val="Heading1"/>
+        <w:spacing w:after="160" w:before="360"/>
+      </w:pPr>
+      <w:r>
+        <w:t xml:space="preserve">Cập nhật v0.2 – 2026-09-23</w:t>
+      </w:r>
+    </w:p>
+    <w:p>
+      <w:pPr>
+        <w:spacing w:after="120"/>
+      </w:pPr>
+      <w:r>
+        <w:rPr>
+          <w:i/>
+          <w:iCs/>
+        </w:rPr>
+        <w:t xml:space="preserve">Phần này chỉ bổ sung. Toàn bộ nội dung phía trên được giữ nguyên để truy vết; khi có khác biệt, mục cập nhật có ngày mới hơn là quyết định hiện hành.</w:t>
+      </w:r>
+    </w:p>
+    <w:p>
+      <w:pPr>
+        <w:spacing w:after="120"/>
+      </w:pPr>
+      <w:r>
+        <w:t xml:space="preserve">Bảng dưới ghi thay đổi và trạng thái so với backlog v0.1. "Chờ apply" nghĩa là migration chưa được chạy trên database Supabase và luồng trình duyệt với dữ liệu thật chưa được thử.</w:t>
+      </w:r>
+    </w:p>
+    <w:tbl>
+      <w:tblPr>
+        <w:tblW w:type="dxa" w:w="9000"/>
+        <w:tblBorders>
+          <w:top w:val="single" w:color="auto" w:sz="4"/>
+          <w:left w:val="single" w:color="auto" w:sz="4"/>
+          <w:bottom w:val="single" w:color="auto" w:sz="4"/>
+          <w:right w:val="single" w:color="auto" w:sz="4"/>
+          <w:insideH w:val="single" w:color="auto" w:sz="4"/>
+          <w:insideV w:val="single" w:color="auto" w:sz="4"/>
+        </w:tblBorders>
+      </w:tblPr>
+      <w:tblGrid>
+        <w:gridCol w:w="1200"/>
+        <w:gridCol w:w="5600"/>
+        <w:gridCol w:w="2200"/>
+      </w:tblGrid>
+      <w:tr>
+        <w:trPr>
+          <w:tblHeader/>
+        </w:trPr>
+        <w:tc>
+          <w:tcPr>
+            <w:tcW w:type="dxa" w:w="1200"/>
+            <w:shd w:fill="1F2A44" w:val="clear"/>
+            <w:tcMar>
+              <w:top w:type="dxa" w:w="70"/>
+              <w:left w:type="dxa" w:w="90"/>
+              <w:bottom w:type="dxa" w:w="70"/>
+              <w:right w:type="dxa" w:w="90"/>
+            </w:tcMar>
+          </w:tcPr>
+          <w:p>
+            <w:r>
+              <w:rPr>
+                <w:b/>
+                <w:bCs/>
+                <w:color w:val="FFFFFF"/>
+                <w:sz w:val="18"/>
+                <w:szCs w:val="18"/>
+              </w:rPr>
+              <w:t xml:space="preserve">Story ID</w:t>
+            </w:r>
+          </w:p>
+        </w:tc>
+        <w:tc>
+          <w:tcPr>
+            <w:tcW w:type="dxa" w:w="5600"/>
+            <w:shd w:fill="1F2A44" w:val="clear"/>
+            <w:tcMar>
+              <w:top w:type="dxa" w:w="70"/>
+              <w:left w:type="dxa" w:w="90"/>
+              <w:bottom w:type="dxa" w:w="70"/>
+              <w:right w:type="dxa" w:w="90"/>
+            </w:tcMar>
+          </w:tcPr>
+          <w:p>
+            <w:r>
+              <w:rPr>
+                <w:b/>
+                <w:bCs/>
+                <w:color w:val="FFFFFF"/>
+                <w:sz w:val="18"/>
+                <w:szCs w:val="18"/>
+              </w:rPr>
+              <w:t xml:space="preserve">Nội dung cập nhật</w:t>
+            </w:r>
+          </w:p>
+        </w:tc>
+        <w:tc>
+          <w:tcPr>
+            <w:tcW w:type="dxa" w:w="2200"/>
+            <w:shd w:fill="1F2A44" w:val="clear"/>
+            <w:tcMar>
+              <w:top w:type="dxa" w:w="70"/>
+              <w:left w:type="dxa" w:w="90"/>
+              <w:bottom w:type="dxa" w:w="70"/>
+              <w:right w:type="dxa" w:w="90"/>
+            </w:tcMar>
+          </w:tcPr>
+          <w:p>
+            <w:r>
+              <w:rPr>
+                <w:b/>
+                <w:bCs/>
+                <w:color w:val="FFFFFF"/>
+                <w:sz w:val="18"/>
+                <w:szCs w:val="18"/>
+              </w:rPr>
+              <w:t xml:space="preserve">Trạng thái</w:t>
+            </w:r>
+          </w:p>
+        </w:tc>
+      </w:tr>
+      <w:tr>
+        <w:tc>
+          <w:tcPr>
+            <w:tcW w:type="dxa" w:w="1200"/>
+            <w:tcMar>
+              <w:top w:type="dxa" w:w="70"/>
+              <w:left w:type="dxa" w:w="90"/>
+              <w:bottom w:type="dxa" w:w="70"/>
+              <w:right w:type="dxa" w:w="90"/>
+            </w:tcMar>
+          </w:tcPr>
+          <w:p>
+            <w:r>
+              <w:rPr>
+                <w:b w:val="false"/>
+                <w:bCs w:val="false"/>
+                <w:sz w:val="18"/>
+                <w:szCs w:val="18"/>
+              </w:rPr>
+              <w:t xml:space="preserve">S1-04</w:t>
+            </w:r>
+          </w:p>
+        </w:tc>
+        <w:tc>
+          <w:tcPr>
+            <w:tcW w:type="dxa" w:w="5600"/>
+            <w:tcMar>
+              <w:top w:type="dxa" w:w="70"/>
+              <w:left w:type="dxa" w:w="90"/>
+              <w:bottom w:type="dxa" w:w="70"/>
+              <w:right w:type="dxa" w:w="90"/>
+            </w:tcMar>
+          </w:tcPr>
+          <w:p>
+            <w:r>
+              <w:rPr>
+                <w:b w:val="false"/>
+                <w:bCs w:val="false"/>
+                <w:sz w:val="18"/>
+                <w:szCs w:val="18"/>
+              </w:rPr>
+              <w:t xml:space="preserve">Ghi chú: ORM thực tế là Prisma (PROJECT_SPEC.md Section 3), không phải Drizzle. Dòng gốc giữ nguyên để truy vết.</w:t>
+            </w:r>
+          </w:p>
+        </w:tc>
+        <w:tc>
+          <w:tcPr>
+            <w:tcW w:type="dxa" w:w="2200"/>
+            <w:tcMar>
+              <w:top w:type="dxa" w:w="70"/>
+              <w:left w:type="dxa" w:w="90"/>
+              <w:bottom w:type="dxa" w:w="70"/>
+              <w:right w:type="dxa" w:w="90"/>
+            </w:tcMar>
+          </w:tcPr>
+          <w:p>
+            <w:r>
+              <w:rPr>
+                <w:b w:val="false"/>
+                <w:bCs w:val="false"/>
+                <w:sz w:val="18"/>
+                <w:szCs w:val="18"/>
+              </w:rPr>
+              <w:t xml:space="preserve">Đã hoàn thành (Prisma)</w:t>
+            </w:r>
+          </w:p>
+        </w:tc>
+      </w:tr>
+      <w:tr>
+        <w:tc>
+          <w:tcPr>
+            <w:tcW w:type="dxa" w:w="1200"/>
+            <w:tcMar>
+              <w:top w:type="dxa" w:w="70"/>
+              <w:left w:type="dxa" w:w="90"/>
+              <w:bottom w:type="dxa" w:w="70"/>
+              <w:right w:type="dxa" w:w="90"/>
+            </w:tcMar>
+          </w:tcPr>
+          <w:p>
+            <w:r>
+              <w:rPr>
+                <w:b w:val="false"/>
+                <w:bCs w:val="false"/>
+                <w:sz w:val="18"/>
+                <w:szCs w:val="18"/>
+              </w:rPr>
+              <w:t xml:space="preserve">S2-07 (mới)</w:t>
+            </w:r>
+          </w:p>
+        </w:tc>
+        <w:tc>
+          <w:tcPr>
+            <w:tcW w:type="dxa" w:w="5600"/>
+            <w:tcMar>
+              <w:top w:type="dxa" w:w="70"/>
+              <w:left w:type="dxa" w:w="90"/>
+              <w:bottom w:type="dxa" w:w="70"/>
+              <w:right w:type="dxa" w:w="90"/>
+            </w:tcMar>
+          </w:tcPr>
+          <w:p>
+            <w:r>
+              <w:rPr>
+                <w:b w:val="false"/>
+                <w:bCs w:val="false"/>
+                <w:sz w:val="18"/>
+                <w:szCs w:val="18"/>
+              </w:rPr>
+              <w:t xml:space="preserve">Chỉ ghi lại last_verified_at khi nguồn chuyển sang verified hoặc operator tick "xác minh lại hôm nay"; đổi URL/tier của nguồn đã verified bắt buộc xác minh lại. Migration 20260923091000_source_reverification.</w:t>
+            </w:r>
+          </w:p>
+        </w:tc>
+        <w:tc>
+          <w:tcPr>
+            <w:tcW w:type="dxa" w:w="2200"/>
+            <w:tcMar>
+              <w:top w:type="dxa" w:w="70"/>
+              <w:left w:type="dxa" w:w="90"/>
+              <w:bottom w:type="dxa" w:w="70"/>
+              <w:right w:type="dxa" w:w="90"/>
+            </w:tcMar>
+          </w:tcPr>
+          <w:p>
+            <w:r>
+              <w:rPr>
+                <w:b w:val="false"/>
+                <w:bCs w:val="false"/>
+                <w:sz w:val="18"/>
+                <w:szCs w:val="18"/>
+              </w:rPr>
+              <w:t xml:space="preserve">Đã code + test tự động; chờ apply migration lên Supabase</w:t>
+            </w:r>
+          </w:p>
+        </w:tc>
+      </w:tr>
+      <w:tr>
+        <w:tc>
+          <w:tcPr>
+            <w:tcW w:type="dxa" w:w="1200"/>
+            <w:tcMar>
+              <w:top w:type="dxa" w:w="70"/>
+              <w:left w:type="dxa" w:w="90"/>
+              <w:bottom w:type="dxa" w:w="70"/>
+              <w:right w:type="dxa" w:w="90"/>
+            </w:tcMar>
+          </w:tcPr>
+          <w:p>
+            <w:r>
+              <w:rPr>
+                <w:b w:val="false"/>
+                <w:bCs w:val="false"/>
+                <w:sz w:val="18"/>
+                <w:szCs w:val="18"/>
+              </w:rPr>
+              <w:t xml:space="preserve">S4-06 (mới)</w:t>
+            </w:r>
+          </w:p>
+        </w:tc>
+        <w:tc>
+          <w:tcPr>
+            <w:tcW w:type="dxa" w:w="5600"/>
+            <w:tcMar>
+              <w:top w:type="dxa" w:w="70"/>
+              <w:left w:type="dxa" w:w="90"/>
+              <w:bottom w:type="dxa" w:w="70"/>
+              <w:right w:type="dxa" w:w="90"/>
+            </w:tcMar>
+          </w:tcPr>
+          <w:p>
+            <w:r>
+              <w:rPr>
+                <w:b w:val="false"/>
+                <w:bCs w:val="false"/>
+                <w:sz w:val="18"/>
+                <w:szCs w:val="18"/>
+              </w:rPr>
+              <w:t xml:space="preserve">Fact proposed không được đánh dấu mâu thuẫn; chỉ fact reviewed/conflicted mới được ghép cặp xung đột. Migration 20260923090000_fact_conflict_requires_review.</w:t>
+            </w:r>
+          </w:p>
+        </w:tc>
+        <w:tc>
+          <w:tcPr>
+            <w:tcW w:type="dxa" w:w="2200"/>
+            <w:tcMar>
+              <w:top w:type="dxa" w:w="70"/>
+              <w:left w:type="dxa" w:w="90"/>
+              <w:bottom w:type="dxa" w:w="70"/>
+              <w:right w:type="dxa" w:w="90"/>
+            </w:tcMar>
+          </w:tcPr>
+          <w:p>
+            <w:r>
+              <w:rPr>
+                <w:b w:val="false"/>
+                <w:bCs w:val="false"/>
+                <w:sz w:val="18"/>
+                <w:szCs w:val="18"/>
+              </w:rPr>
+              <w:t xml:space="preserve">Đã code + test tự động; chờ apply migration lên Supabase</w:t>
+            </w:r>
+          </w:p>
+        </w:tc>
+      </w:tr>
+      <w:tr>
+        <w:tc>
+          <w:tcPr>
+            <w:tcW w:type="dxa" w:w="1200"/>
+            <w:tcMar>
+              <w:top w:type="dxa" w:w="70"/>
+              <w:left w:type="dxa" w:w="90"/>
+              <w:bottom w:type="dxa" w:w="70"/>
+              <w:right w:type="dxa" w:w="90"/>
+            </w:tcMar>
+          </w:tcPr>
+          <w:p>
+            <w:r>
+              <w:rPr>
+                <w:b w:val="false"/>
+                <w:bCs w:val="false"/>
+                <w:sz w:val="18"/>
+                <w:szCs w:val="18"/>
+              </w:rPr>
+              <w:t xml:space="preserve">S5-01</w:t>
+            </w:r>
+          </w:p>
+        </w:tc>
+        <w:tc>
+          <w:tcPr>
+            <w:tcW w:type="dxa" w:w="5600"/>
+            <w:tcMar>
+              <w:top w:type="dxa" w:w="70"/>
+              <w:left w:type="dxa" w:w="90"/>
+              <w:bottom w:type="dxa" w:w="70"/>
+              <w:right w:type="dxa" w:w="90"/>
+            </w:tcMar>
+          </w:tcPr>
+          <w:p>
+            <w:r>
+              <w:rPr>
+                <w:b w:val="false"/>
+                <w:bCs w:val="false"/>
+                <w:sz w:val="18"/>
+                <w:szCs w:val="18"/>
+              </w:rPr>
+              <w:t xml:space="preserve">Phương án A: universities/programmes chỉ lưu thông tin nhận diện + document và trích đoạn chứng minh tồn tại; không có cột tuition/application_deadline. Thêm education_reviews và quyền education.manage. Migration 20260923100000_education.</w:t>
+            </w:r>
+          </w:p>
+        </w:tc>
+        <w:tc>
+          <w:tcPr>
+            <w:tcW w:type="dxa" w:w="2200"/>
+            <w:tcMar>
+              <w:top w:type="dxa" w:w="70"/>
+              <w:left w:type="dxa" w:w="90"/>
+              <w:bottom w:type="dxa" w:w="70"/>
+              <w:right w:type="dxa" w:w="90"/>
+            </w:tcMar>
+          </w:tcPr>
+          <w:p>
+            <w:r>
+              <w:rPr>
+                <w:b w:val="false"/>
+                <w:bCs w:val="false"/>
+                <w:sz w:val="18"/>
+                <w:szCs w:val="18"/>
+              </w:rPr>
+              <w:t xml:space="preserve">Đã code + test tự động; chờ apply migration lên Supabase</w:t>
+            </w:r>
+          </w:p>
+        </w:tc>
+      </w:tr>
+      <w:tr>
+        <w:tc>
+          <w:tcPr>
+            <w:tcW w:type="dxa" w:w="1200"/>
+            <w:tcMar>
+              <w:top w:type="dxa" w:w="70"/>
+              <w:left w:type="dxa" w:w="90"/>
+              <w:bottom w:type="dxa" w:w="70"/>
+              <w:right w:type="dxa" w:w="90"/>
+            </w:tcMar>
+          </w:tcPr>
+          <w:p>
+            <w:r>
+              <w:rPr>
+                <w:b w:val="false"/>
+                <w:bCs w:val="false"/>
+                <w:sz w:val="18"/>
+                <w:szCs w:val="18"/>
+              </w:rPr>
+              <w:t xml:space="preserve">S5-02</w:t>
+            </w:r>
+          </w:p>
+        </w:tc>
+        <w:tc>
+          <w:tcPr>
+            <w:tcW w:type="dxa" w:w="5600"/>
+            <w:tcMar>
+              <w:top w:type="dxa" w:w="70"/>
+              <w:left w:type="dxa" w:w="90"/>
+              <w:bottom w:type="dxa" w:w="70"/>
+              <w:right w:type="dxa" w:w="90"/>
+            </w:tcMar>
+          </w:tcPr>
+          <w:p>
+            <w:r>
+              <w:rPr>
+                <w:b w:val="false"/>
+                <w:bCs w:val="false"/>
+                <w:sz w:val="18"/>
+                <w:szCs w:val="18"/>
+              </w:rPr>
+              <w:t xml:space="preserve">Trang /programmes lọc theo quốc gia, bậc học, ngành, trường. Bộ lọc "loại tài trợ" hoãn lại: chưa có mô hình dữ liệu tài trợ/học bổng có bằng chứng.</w:t>
+            </w:r>
+          </w:p>
+        </w:tc>
+        <w:tc>
+          <w:tcPr>
+            <w:tcW w:type="dxa" w:w="2200"/>
+            <w:tcMar>
+              <w:top w:type="dxa" w:w="70"/>
+              <w:left w:type="dxa" w:w="90"/>
+              <w:bottom w:type="dxa" w:w="70"/>
+              <w:right w:type="dxa" w:w="90"/>
+            </w:tcMar>
+          </w:tcPr>
+          <w:p>
+            <w:r>
+              <w:rPr>
+                <w:b w:val="false"/>
+                <w:bCs w:val="false"/>
+                <w:sz w:val="18"/>
+                <w:szCs w:val="18"/>
+              </w:rPr>
+              <w:t xml:space="preserve">Hoàn thành một phần</w:t>
+            </w:r>
+          </w:p>
+        </w:tc>
+      </w:tr>
+      <w:tr>
+        <w:tc>
+          <w:tcPr>
+            <w:tcW w:type="dxa" w:w="1200"/>
+            <w:tcMar>
+              <w:top w:type="dxa" w:w="70"/>
+              <w:left w:type="dxa" w:w="90"/>
+              <w:bottom w:type="dxa" w:w="70"/>
+              <w:right w:type="dxa" w:w="90"/>
+            </w:tcMar>
+          </w:tcPr>
+          <w:p>
+            <w:r>
+              <w:rPr>
+                <w:b w:val="false"/>
+                <w:bCs w:val="false"/>
+                <w:sz w:val="18"/>
+                <w:szCs w:val="18"/>
+              </w:rPr>
+              <w:t xml:space="preserve">S5-03</w:t>
+            </w:r>
+          </w:p>
+        </w:tc>
+        <w:tc>
+          <w:tcPr>
+            <w:tcW w:type="dxa" w:w="5600"/>
+            <w:tcMar>
+              <w:top w:type="dxa" w:w="70"/>
+              <w:left w:type="dxa" w:w="90"/>
+              <w:bottom w:type="dxa" w:w="70"/>
+              <w:right w:type="dxa" w:w="90"/>
+            </w:tcMar>
+          </w:tcPr>
+          <w:p>
+            <w:r>
+              <w:rPr>
+                <w:b w:val="false"/>
+                <w:bCs w:val="false"/>
+                <w:sz w:val="18"/>
+                <w:szCs w:val="18"/>
+              </w:rPr>
+              <w:t xml:space="preserve">Trang /programmes/[id]: thông tin nhận diện, bằng chứng tồn tại (nguồn, tier, ngày thu thập) và các fact đã duyệt của chương trình.</w:t>
+            </w:r>
+          </w:p>
+        </w:tc>
+        <w:tc>
+          <w:tcPr>
+            <w:tcW w:type="dxa" w:w="2200"/>
+            <w:tcMar>
+              <w:top w:type="dxa" w:w="70"/>
+              <w:left w:type="dxa" w:w="90"/>
+              <w:bottom w:type="dxa" w:w="70"/>
+              <w:right w:type="dxa" w:w="90"/>
+            </w:tcMar>
+          </w:tcPr>
+          <w:p>
+            <w:r>
+              <w:rPr>
+                <w:b w:val="false"/>
+                <w:bCs w:val="false"/>
+                <w:sz w:val="18"/>
+                <w:szCs w:val="18"/>
+              </w:rPr>
+              <w:t xml:space="preserve">Đã code + test tự động; chờ apply migration lên Supabase</w:t>
+            </w:r>
+          </w:p>
+        </w:tc>
+      </w:tr>
+      <w:tr>
+        <w:tc>
+          <w:tcPr>
+            <w:tcW w:type="dxa" w:w="1200"/>
+            <w:tcMar>
+              <w:top w:type="dxa" w:w="70"/>
+              <w:left w:type="dxa" w:w="90"/>
+              <w:bottom w:type="dxa" w:w="70"/>
+              <w:right w:type="dxa" w:w="90"/>
+            </w:tcMar>
+          </w:tcPr>
+          <w:p>
+            <w:r>
+              <w:rPr>
+                <w:b w:val="false"/>
+                <w:bCs w:val="false"/>
+                <w:sz w:val="18"/>
+                <w:szCs w:val="18"/>
+              </w:rPr>
+              <w:t xml:space="preserve">S5-04</w:t>
+            </w:r>
+          </w:p>
+        </w:tc>
+        <w:tc>
+          <w:tcPr>
+            <w:tcW w:type="dxa" w:w="5600"/>
+            <w:tcMar>
+              <w:top w:type="dxa" w:w="70"/>
+              <w:left w:type="dxa" w:w="90"/>
+              <w:bottom w:type="dxa" w:w="70"/>
+              <w:right w:type="dxa" w:w="90"/>
+            </w:tcMar>
+          </w:tcPr>
+          <w:p>
+            <w:r>
+              <w:rPr>
+                <w:b w:val="false"/>
+                <w:bCs w:val="false"/>
+                <w:sz w:val="18"/>
+                <w:szCs w:val="18"/>
+              </w:rPr>
+              <w:t xml:space="preserve">Học phí/deadline/thời lượng/học bổng là Fact gắn programme_id hoặc university_id, dùng lại quy trình evidence/review/conflict của Slice 4. Quốc gia của fact tự lấy theo trường; chọn quốc gia khác bị từ chối.</w:t>
+            </w:r>
+          </w:p>
+        </w:tc>
+        <w:tc>
+          <w:tcPr>
+            <w:tcW w:type="dxa" w:w="2200"/>
+            <w:tcMar>
+              <w:top w:type="dxa" w:w="70"/>
+              <w:left w:type="dxa" w:w="90"/>
+              <w:bottom w:type="dxa" w:w="70"/>
+              <w:right w:type="dxa" w:w="90"/>
+            </w:tcMar>
+          </w:tcPr>
+          <w:p>
+            <w:r>
+              <w:rPr>
+                <w:b w:val="false"/>
+                <w:bCs w:val="false"/>
+                <w:sz w:val="18"/>
+                <w:szCs w:val="18"/>
+              </w:rPr>
+              <w:t xml:space="preserve">Đã code + test tự động; chờ apply migration lên Supabase</w:t>
+            </w:r>
+          </w:p>
+        </w:tc>
+      </w:tr>
+      <w:tr>
+        <w:tc>
+          <w:tcPr>
+            <w:tcW w:type="dxa" w:w="1200"/>
+            <w:tcMar>
+              <w:top w:type="dxa" w:w="70"/>
+              <w:left w:type="dxa" w:w="90"/>
+              <w:bottom w:type="dxa" w:w="70"/>
+              <w:right w:type="dxa" w:w="90"/>
+            </w:tcMar>
+          </w:tcPr>
+          <w:p>
+            <w:r>
+              <w:rPr>
+                <w:b w:val="false"/>
+                <w:bCs w:val="false"/>
+                <w:sz w:val="18"/>
+                <w:szCs w:val="18"/>
+              </w:rPr>
+              <w:t xml:space="preserve">S5-05</w:t>
+            </w:r>
+          </w:p>
+        </w:tc>
+        <w:tc>
+          <w:tcPr>
+            <w:tcW w:type="dxa" w:w="5600"/>
+            <w:tcMar>
+              <w:top w:type="dxa" w:w="70"/>
+              <w:left w:type="dxa" w:w="90"/>
+              <w:bottom w:type="dxa" w:w="70"/>
+              <w:right w:type="dxa" w:w="90"/>
+            </w:tcMar>
+          </w:tcPr>
+          <w:p>
+            <w:r>
+              <w:rPr>
+                <w:b w:val="false"/>
+                <w:bCs w:val="false"/>
+                <w:sz w:val="18"/>
+                <w:szCs w:val="18"/>
+              </w:rPr>
+              <w:t xml:space="preserve">deadline_type (fixed/rolling/year_round) là cột trên facts; hiển thị trên thẻ fact.</w:t>
+            </w:r>
+          </w:p>
+        </w:tc>
+        <w:tc>
+          <w:tcPr>
+            <w:tcW w:type="dxa" w:w="2200"/>
+            <w:tcMar>
+              <w:top w:type="dxa" w:w="70"/>
+              <w:left w:type="dxa" w:w="90"/>
+              <w:bottom w:type="dxa" w:w="70"/>
+              <w:right w:type="dxa" w:w="90"/>
+            </w:tcMar>
+          </w:tcPr>
+          <w:p>
+            <w:r>
+              <w:rPr>
+                <w:b w:val="false"/>
+                <w:bCs w:val="false"/>
+                <w:sz w:val="18"/>
+                <w:szCs w:val="18"/>
+              </w:rPr>
+              <w:t xml:space="preserve">Đã code + test tự động; chờ apply migration lên Supabase</w:t>
+            </w:r>
+          </w:p>
+        </w:tc>
+      </w:tr>
+      <w:tr>
+        <w:tc>
+          <w:tcPr>
+            <w:tcW w:type="dxa" w:w="1200"/>
+            <w:tcMar>
+              <w:top w:type="dxa" w:w="70"/>
+              <w:left w:type="dxa" w:w="90"/>
+              <w:bottom w:type="dxa" w:w="70"/>
+              <w:right w:type="dxa" w:w="90"/>
+            </w:tcMar>
+          </w:tcPr>
+          <w:p>
+            <w:r>
+              <w:rPr>
+                <w:b w:val="false"/>
+                <w:bCs w:val="false"/>
+                <w:sz w:val="18"/>
+                <w:szCs w:val="18"/>
+              </w:rPr>
+              <w:t xml:space="preserve">S5-06 (mới)</w:t>
+            </w:r>
+          </w:p>
+        </w:tc>
+        <w:tc>
+          <w:tcPr>
+            <w:tcW w:type="dxa" w:w="5600"/>
+            <w:tcMar>
+              <w:top w:type="dxa" w:w="70"/>
+              <w:left w:type="dxa" w:w="90"/>
+              <w:bottom w:type="dxa" w:w="70"/>
+              <w:right w:type="dxa" w:w="90"/>
+            </w:tcMar>
+          </w:tcPr>
+          <w:p>
+            <w:r>
+              <w:rPr>
+                <w:b w:val="false"/>
+                <w:bCs w:val="false"/>
+                <w:sz w:val="18"/>
+                <w:szCs w:val="18"/>
+              </w:rPr>
+              <w:t xml:space="preserve">Workspace /education/workspace: đề xuất trường/chương trình (education.manage) và duyệt (facts.review). Trang /universities công khai.</w:t>
+            </w:r>
+          </w:p>
+        </w:tc>
+        <w:tc>
+          <w:tcPr>
+            <w:tcW w:type="dxa" w:w="2200"/>
+            <w:tcMar>
+              <w:top w:type="dxa" w:w="70"/>
+              <w:left w:type="dxa" w:w="90"/>
+              <w:bottom w:type="dxa" w:w="70"/>
+              <w:right w:type="dxa" w:w="90"/>
+            </w:tcMar>
+          </w:tcPr>
+          <w:p>
+            <w:r>
+              <w:rPr>
+                <w:b w:val="false"/>
+                <w:bCs w:val="false"/>
+                <w:sz w:val="18"/>
+                <w:szCs w:val="18"/>
+              </w:rPr>
+              <w:t xml:space="preserve">Đã code + test tự động; chờ apply migration lên Supabase</w:t>
+            </w:r>
+          </w:p>
+        </w:tc>
+      </w:tr>
+    </w:tbl>
+    <w:p>
+      <w:pPr>
+        <w:spacing w:after="120"/>
+      </w:pPr>
+      <w:r>
+        <w:t xml:space="preserve">Cập nhật v0.3 – 2026-09-23: Slice 6 được tách thành 6a (Immigration) và 6b (Labour Market).</w:t>
+      </w:r>
+    </w:p>
+    <w:tbl>
+      <w:tblPr>
+        <w:tblW w:type="dxa" w:w="9000"/>
+        <w:tblBorders>
+          <w:top w:val="single" w:color="auto" w:sz="4"/>
+          <w:left w:val="single" w:color="auto" w:sz="4"/>
+          <w:bottom w:val="single" w:color="auto" w:sz="4"/>
+          <w:right w:val="single" w:color="auto" w:sz="4"/>
+          <w:insideH w:val="single" w:color="auto" w:sz="4"/>
+          <w:insideV w:val="single" w:color="auto" w:sz="4"/>
+        </w:tblBorders>
+      </w:tblPr>
+      <w:tblGrid>
+        <w:gridCol w:w="1200"/>
+        <w:gridCol w:w="5600"/>
+        <w:gridCol w:w="2200"/>
+      </w:tblGrid>
+      <w:tr>
+        <w:trPr>
+          <w:tblHeader/>
+        </w:trPr>
+        <w:tc>
+          <w:tcPr>
+            <w:tcW w:type="dxa" w:w="1200"/>
+            <w:shd w:fill="1F2A44" w:val="clear"/>
+            <w:tcMar>
+              <w:top w:type="dxa" w:w="70"/>
+              <w:left w:type="dxa" w:w="90"/>
+              <w:bottom w:type="dxa" w:w="70"/>
+              <w:right w:type="dxa" w:w="90"/>
+            </w:tcMar>
+          </w:tcPr>
+          <w:p>
+            <w:r>
+              <w:rPr>
+                <w:b/>
+                <w:bCs/>
+                <w:color w:val="FFFFFF"/>
+                <w:sz w:val="18"/>
+                <w:szCs w:val="18"/>
+              </w:rPr>
+              <w:t xml:space="preserve">Story ID</w:t>
+            </w:r>
+          </w:p>
+        </w:tc>
+        <w:tc>
+          <w:tcPr>
+            <w:tcW w:type="dxa" w:w="5600"/>
+            <w:shd w:fill="1F2A44" w:val="clear"/>
+            <w:tcMar>
+              <w:top w:type="dxa" w:w="70"/>
+              <w:left w:type="dxa" w:w="90"/>
+              <w:bottom w:type="dxa" w:w="70"/>
+              <w:right w:type="dxa" w:w="90"/>
+            </w:tcMar>
+          </w:tcPr>
+          <w:p>
+            <w:r>
+              <w:rPr>
+                <w:b/>
+                <w:bCs/>
+                <w:color w:val="FFFFFF"/>
+                <w:sz w:val="18"/>
+                <w:szCs w:val="18"/>
+              </w:rPr>
+              <w:t xml:space="preserve">Nội dung cập nhật</w:t>
+            </w:r>
+          </w:p>
+        </w:tc>
+        <w:tc>
+          <w:tcPr>
+            <w:tcW w:type="dxa" w:w="2200"/>
+            <w:shd w:fill="1F2A44" w:val="clear"/>
+            <w:tcMar>
+              <w:top w:type="dxa" w:w="70"/>
+              <w:left w:type="dxa" w:w="90"/>
+              <w:bottom w:type="dxa" w:w="70"/>
+              <w:right w:type="dxa" w:w="90"/>
+            </w:tcMar>
+          </w:tcPr>
+          <w:p>
+            <w:r>
+              <w:rPr>
+                <w:b/>
+                <w:bCs/>
+                <w:color w:val="FFFFFF"/>
+                <w:sz w:val="18"/>
+                <w:szCs w:val="18"/>
+              </w:rPr>
+              <w:t xml:space="preserve">Trạng thái</w:t>
+            </w:r>
+          </w:p>
+        </w:tc>
+      </w:tr>
+      <w:tr>
+        <w:tc>
+          <w:tcPr>
+            <w:tcW w:type="dxa" w:w="1200"/>
+            <w:tcMar>
+              <w:top w:type="dxa" w:w="70"/>
+              <w:left w:type="dxa" w:w="90"/>
+              <w:bottom w:type="dxa" w:w="70"/>
+              <w:right w:type="dxa" w:w="90"/>
+            </w:tcMar>
+          </w:tcPr>
+          <w:p>
+            <w:r>
+              <w:rPr>
+                <w:b w:val="false"/>
+                <w:bCs w:val="false"/>
+                <w:sz w:val="18"/>
+                <w:szCs w:val="18"/>
+              </w:rPr>
+              <w:t xml:space="preserve">S6-01</w:t>
+            </w:r>
+          </w:p>
+        </w:tc>
+        <w:tc>
+          <w:tcPr>
+            <w:tcW w:type="dxa" w:w="5600"/>
+            <w:tcMar>
+              <w:top w:type="dxa" w:w="70"/>
+              <w:left w:type="dxa" w:w="90"/>
+              <w:bottom w:type="dxa" w:w="70"/>
+              <w:right w:type="dxa" w:w="90"/>
+            </w:tcMar>
+          </w:tcPr>
+          <w:p>
+            <w:r>
+              <w:rPr>
+                <w:b w:val="false"/>
+                <w:bCs w:val="false"/>
+                <w:sz w:val="18"/>
+                <w:szCs w:val="18"/>
+              </w:rPr>
+              <w:t xml:space="preserve">immigration_rules chỉ lưu thông tin nhận diện + document T1 cùng quốc gia; điều kiện là Fact gắn immigration_rule_id. Thêm immigration_rule_reviews, quyền immigration.manage. Migration 20260923120000_immigration.</w:t>
+            </w:r>
+          </w:p>
+        </w:tc>
+        <w:tc>
+          <w:tcPr>
+            <w:tcW w:type="dxa" w:w="2200"/>
+            <w:tcMar>
+              <w:top w:type="dxa" w:w="70"/>
+              <w:left w:type="dxa" w:w="90"/>
+              <w:bottom w:type="dxa" w:w="70"/>
+              <w:right w:type="dxa" w:w="90"/>
+            </w:tcMar>
+          </w:tcPr>
+          <w:p>
+            <w:r>
+              <w:rPr>
+                <w:b w:val="false"/>
+                <w:bCs w:val="false"/>
+                <w:sz w:val="18"/>
+                <w:szCs w:val="18"/>
+              </w:rPr>
+              <w:t xml:space="preserve">Đã code + test tự động; chờ apply migration lên Supabase</w:t>
+            </w:r>
+          </w:p>
+        </w:tc>
+      </w:tr>
+      <w:tr>
+        <w:tc>
+          <w:tcPr>
+            <w:tcW w:type="dxa" w:w="1200"/>
+            <w:tcMar>
+              <w:top w:type="dxa" w:w="70"/>
+              <w:left w:type="dxa" w:w="90"/>
+              <w:bottom w:type="dxa" w:w="70"/>
+              <w:right w:type="dxa" w:w="90"/>
+            </w:tcMar>
+          </w:tcPr>
+          <w:p>
+            <w:r>
+              <w:rPr>
+                <w:b w:val="false"/>
+                <w:bCs w:val="false"/>
+                <w:sz w:val="18"/>
+                <w:szCs w:val="18"/>
+              </w:rPr>
+              <w:t xml:space="preserve">S6-02</w:t>
+            </w:r>
+          </w:p>
+        </w:tc>
+        <w:tc>
+          <w:tcPr>
+            <w:tcW w:type="dxa" w:w="5600"/>
+            <w:tcMar>
+              <w:top w:type="dxa" w:w="70"/>
+              <w:left w:type="dxa" w:w="90"/>
+              <w:bottom w:type="dxa" w:w="70"/>
+              <w:right w:type="dxa" w:w="90"/>
+            </w:tcMar>
+          </w:tcPr>
+          <w:p>
+            <w:r>
+              <w:rPr>
+                <w:b w:val="false"/>
+                <w:bCs w:val="false"/>
+                <w:sz w:val="18"/>
+                <w:szCs w:val="18"/>
+              </w:rPr>
+              <w:t xml:space="preserve">/immigration (lọc quốc gia, loại quy định, link cơ quan di trú T1) và /immigration/[id]; chỉ hiển thị khi đã duyệt và nguồn T1 đã verified; luôn có disclaimer.</w:t>
+            </w:r>
+          </w:p>
+        </w:tc>
+        <w:tc>
+          <w:tcPr>
+            <w:tcW w:type="dxa" w:w="2200"/>
+            <w:tcMar>
+              <w:top w:type="dxa" w:w="70"/>
+              <w:left w:type="dxa" w:w="90"/>
+              <w:bottom w:type="dxa" w:w="70"/>
+              <w:right w:type="dxa" w:w="90"/>
+            </w:tcMar>
+          </w:tcPr>
+          <w:p>
+            <w:r>
+              <w:rPr>
+                <w:b w:val="false"/>
+                <w:bCs w:val="false"/>
+                <w:sz w:val="18"/>
+                <w:szCs w:val="18"/>
+              </w:rPr>
+              <w:t xml:space="preserve">Đã code + test tự động; chờ apply migration lên Supabase</w:t>
+            </w:r>
+          </w:p>
+        </w:tc>
+      </w:tr>
+      <w:tr>
+        <w:tc>
+          <w:tcPr>
+            <w:tcW w:type="dxa" w:w="1200"/>
+            <w:tcMar>
+              <w:top w:type="dxa" w:w="70"/>
+              <w:left w:type="dxa" w:w="90"/>
+              <w:bottom w:type="dxa" w:w="70"/>
+              <w:right w:type="dxa" w:w="90"/>
+            </w:tcMar>
+          </w:tcPr>
+          <w:p>
+            <w:r>
+              <w:rPr>
+                <w:b w:val="false"/>
+                <w:bCs w:val="false"/>
+                <w:sz w:val="18"/>
+                <w:szCs w:val="18"/>
+              </w:rPr>
+              <w:t xml:space="preserve">S6-03</w:t>
+            </w:r>
+          </w:p>
+        </w:tc>
+        <w:tc>
+          <w:tcPr>
+            <w:tcW w:type="dxa" w:w="5600"/>
+            <w:tcMar>
+              <w:top w:type="dxa" w:w="70"/>
+              <w:left w:type="dxa" w:w="90"/>
+              <w:bottom w:type="dxa" w:w="70"/>
+              <w:right w:type="dxa" w:w="90"/>
+            </w:tcMar>
+          </w:tcPr>
+          <w:p>
+            <w:r>
+              <w:rPr>
+                <w:b w:val="false"/>
+                <w:bCs w:val="false"/>
+                <w:sz w:val="18"/>
+                <w:szCs w:val="18"/>
+              </w:rPr>
+              <w:t xml:space="preserve">Chưa bắt đầu (Slice 6b – Labour Market).</w:t>
+            </w:r>
+          </w:p>
+        </w:tc>
+        <w:tc>
+          <w:tcPr>
+            <w:tcW w:type="dxa" w:w="2200"/>
+            <w:tcMar>
+              <w:top w:type="dxa" w:w="70"/>
+              <w:left w:type="dxa" w:w="90"/>
+              <w:bottom w:type="dxa" w:w="70"/>
+              <w:right w:type="dxa" w:w="90"/>
+            </w:tcMar>
+          </w:tcPr>
+          <w:p>
+            <w:r>
+              <w:rPr>
+                <w:b w:val="false"/>
+                <w:bCs w:val="false"/>
+                <w:sz w:val="18"/>
+                <w:szCs w:val="18"/>
+              </w:rPr>
+              <w:t xml:space="preserve">Chưa làm</w:t>
+            </w:r>
+          </w:p>
+        </w:tc>
+      </w:tr>
+      <w:tr>
+        <w:tc>
+          <w:tcPr>
+            <w:tcW w:type="dxa" w:w="1200"/>
+            <w:tcMar>
+              <w:top w:type="dxa" w:w="70"/>
+              <w:left w:type="dxa" w:w="90"/>
+              <w:bottom w:type="dxa" w:w="70"/>
+              <w:right w:type="dxa" w:w="90"/>
+            </w:tcMar>
+          </w:tcPr>
+          <w:p>
+            <w:r>
+              <w:rPr>
+                <w:b w:val="false"/>
+                <w:bCs w:val="false"/>
+                <w:sz w:val="18"/>
+                <w:szCs w:val="18"/>
+              </w:rPr>
+              <w:t xml:space="preserve">S6-04</w:t>
+            </w:r>
+          </w:p>
+        </w:tc>
+        <w:tc>
+          <w:tcPr>
+            <w:tcW w:type="dxa" w:w="5600"/>
+            <w:tcMar>
+              <w:top w:type="dxa" w:w="70"/>
+              <w:left w:type="dxa" w:w="90"/>
+              <w:bottom w:type="dxa" w:w="70"/>
+              <w:right w:type="dxa" w:w="90"/>
+            </w:tcMar>
+          </w:tcPr>
+          <w:p>
+            <w:r>
+              <w:rPr>
+                <w:b w:val="false"/>
+                <w:bCs w:val="false"/>
+                <w:sz w:val="18"/>
+                <w:szCs w:val="18"/>
+              </w:rPr>
+              <w:t xml:space="preserve">Chưa bắt đầu (Slice 6b – Labour Market).</w:t>
+            </w:r>
+          </w:p>
+        </w:tc>
+        <w:tc>
+          <w:tcPr>
+            <w:tcW w:type="dxa" w:w="2200"/>
+            <w:tcMar>
+              <w:top w:type="dxa" w:w="70"/>
+              <w:left w:type="dxa" w:w="90"/>
+              <w:bottom w:type="dxa" w:w="70"/>
+              <w:right w:type="dxa" w:w="90"/>
+            </w:tcMar>
+          </w:tcPr>
+          <w:p>
+            <w:r>
+              <w:rPr>
+                <w:b w:val="false"/>
+                <w:bCs w:val="false"/>
+                <w:sz w:val="18"/>
+                <w:szCs w:val="18"/>
+              </w:rPr>
+              <w:t xml:space="preserve">Chưa làm</w:t>
+            </w:r>
+          </w:p>
+        </w:tc>
+      </w:tr>
+      <w:tr>
+        <w:tc>
+          <w:tcPr>
+            <w:tcW w:type="dxa" w:w="1200"/>
+            <w:tcMar>
+              <w:top w:type="dxa" w:w="70"/>
+              <w:left w:type="dxa" w:w="90"/>
+              <w:bottom w:type="dxa" w:w="70"/>
+              <w:right w:type="dxa" w:w="90"/>
+            </w:tcMar>
+          </w:tcPr>
+          <w:p>
+            <w:r>
+              <w:rPr>
+                <w:b w:val="false"/>
+                <w:bCs w:val="false"/>
+                <w:sz w:val="18"/>
+                <w:szCs w:val="18"/>
+              </w:rPr>
+              <w:t xml:space="preserve">S6-05</w:t>
+            </w:r>
+          </w:p>
+        </w:tc>
+        <w:tc>
+          <w:tcPr>
+            <w:tcW w:type="dxa" w:w="5600"/>
+            <w:tcMar>
+              <w:top w:type="dxa" w:w="70"/>
+              <w:left w:type="dxa" w:w="90"/>
+              <w:bottom w:type="dxa" w:w="70"/>
+              <w:right w:type="dxa" w:w="90"/>
+            </w:tcMar>
+          </w:tcPr>
+          <w:p>
+            <w:r>
+              <w:rPr>
+                <w:b w:val="false"/>
+                <w:bCs w:val="false"/>
+                <w:sz w:val="18"/>
+                <w:szCs w:val="18"/>
+              </w:rPr>
+              <w:t xml:space="preserve">Banner "Thông tin đang có mâu thuẫn giữa các nguồn" trên trang chi tiết quy định khi có điều kiện ở trạng thái conflicted.</w:t>
+            </w:r>
+          </w:p>
+        </w:tc>
+        <w:tc>
+          <w:tcPr>
+            <w:tcW w:type="dxa" w:w="2200"/>
+            <w:tcMar>
+              <w:top w:type="dxa" w:w="70"/>
+              <w:left w:type="dxa" w:w="90"/>
+              <w:bottom w:type="dxa" w:w="70"/>
+              <w:right w:type="dxa" w:w="90"/>
+            </w:tcMar>
+          </w:tcPr>
+          <w:p>
+            <w:r>
+              <w:rPr>
+                <w:b w:val="false"/>
+                <w:bCs w:val="false"/>
+                <w:sz w:val="18"/>
+                <w:szCs w:val="18"/>
+              </w:rPr>
+              <w:t xml:space="preserve">Đã code + test tự động; chờ apply migration lên Supabase</w:t>
+            </w:r>
+          </w:p>
+        </w:tc>
+      </w:tr>
+      <w:tr>
+        <w:tc>
+          <w:tcPr>
+            <w:tcW w:type="dxa" w:w="1200"/>
+            <w:tcMar>
+              <w:top w:type="dxa" w:w="70"/>
+              <w:left w:type="dxa" w:w="90"/>
+              <w:bottom w:type="dxa" w:w="70"/>
+              <w:right w:type="dxa" w:w="90"/>
+            </w:tcMar>
+          </w:tcPr>
+          <w:p>
+            <w:r>
+              <w:rPr>
+                <w:b w:val="false"/>
+                <w:bCs w:val="false"/>
+                <w:sz w:val="18"/>
+                <w:szCs w:val="18"/>
+              </w:rPr>
+              <w:t xml:space="preserve">S6-06 (mới)</w:t>
+            </w:r>
+          </w:p>
+        </w:tc>
+        <w:tc>
+          <w:tcPr>
+            <w:tcW w:type="dxa" w:w="5600"/>
+            <w:tcMar>
+              <w:top w:type="dxa" w:w="70"/>
+              <w:left w:type="dxa" w:w="90"/>
+              <w:bottom w:type="dxa" w:w="70"/>
+              <w:right w:type="dxa" w:w="90"/>
+            </w:tcMar>
+          </w:tcPr>
+          <w:p>
+            <w:r>
+              <w:rPr>
+                <w:b w:val="false"/>
+                <w:bCs w:val="false"/>
+                <w:sz w:val="18"/>
+                <w:szCs w:val="18"/>
+              </w:rPr>
+              <w:t xml:space="preserve">Workspace /immigration/workspace: đề xuất (immigration.manage) và duyệt (facts.review) quy định; hiển thị nguồn T1 đã/chưa verified.</w:t>
+            </w:r>
+          </w:p>
+        </w:tc>
+        <w:tc>
+          <w:tcPr>
+            <w:tcW w:type="dxa" w:w="2200"/>
+            <w:tcMar>
+              <w:top w:type="dxa" w:w="70"/>
+              <w:left w:type="dxa" w:w="90"/>
+              <w:bottom w:type="dxa" w:w="70"/>
+              <w:right w:type="dxa" w:w="90"/>
+            </w:tcMar>
+          </w:tcPr>
+          <w:p>
+            <w:r>
+              <w:rPr>
+                <w:b w:val="false"/>
+                <w:bCs w:val="false"/>
+                <w:sz w:val="18"/>
+                <w:szCs w:val="18"/>
+              </w:rPr>
+              <w:t xml:space="preserve">Đã code + test tự động; chờ apply migration lên Supabase</w:t>
+            </w:r>
+          </w:p>
+        </w:tc>
+      </w:tr>
+    </w:tbl>
     <w:sectPr>
       <w:pgSz w:w="11906" w:h="16838" w:orient="portrait"/>
       <w:pgMar w:top="1440" w:right="1440" w:bottom="1440" w:left="1440" w:header="708" w:footer="708" w:gutter="0"/>

</xml_diff>

<commit_message>
Document Slices 6b and 7 and the dev UI preview
- PROJECT_SPEC.md: notes at the occupations/labour_market_items tables and
  Section 21 Decision Log entries for Slice 6b and Slice 7.
- New architecture and learning docs for Slice 6b and Slice 7; UI design
  system doc gains the /dev/preview section.
- SRS, Product Backlog and User Flow .docx files get appended v0.4/v0.5
  update sections; existing content is unchanged.

Co-Authored-By: Claude Opus 5.5 <noreply@anthropic.com>
</commit_message>
<xml_diff>
--- a/documents/Product_Backlog.docx
+++ b/documents/Product_Backlog.docx
@@ -9845,6 +9845,756 @@
                 <w:szCs w:val="18"/>
               </w:rPr>
               <w:t xml:space="preserve">Workspace /immigration/workspace: đề xuất (immigration.manage) và duyệt (facts.review) quy định; hiển thị nguồn T1 đã/chưa verified.</w:t>
+            </w:r>
+          </w:p>
+        </w:tc>
+        <w:tc>
+          <w:tcPr>
+            <w:tcW w:type="dxa" w:w="2200"/>
+            <w:tcMar>
+              <w:top w:type="dxa" w:w="70"/>
+              <w:left w:type="dxa" w:w="90"/>
+              <w:bottom w:type="dxa" w:w="70"/>
+              <w:right w:type="dxa" w:w="90"/>
+            </w:tcMar>
+          </w:tcPr>
+          <w:p>
+            <w:r>
+              <w:rPr>
+                <w:b w:val="false"/>
+                <w:bCs w:val="false"/>
+                <w:sz w:val="18"/>
+                <w:szCs w:val="18"/>
+              </w:rPr>
+              <w:t xml:space="preserve">Đã code + test tự động; chờ apply migration lên Supabase</w:t>
+            </w:r>
+          </w:p>
+        </w:tc>
+      </w:tr>
+    </w:tbl>
+    <w:p>
+      <w:pPr>
+        <w:spacing w:after="120"/>
+      </w:pPr>
+      <w:r>
+        <w:t xml:space="preserve">Cập nhật v0.4 – 2026-09-25: Slice 6b (Labour Market).</w:t>
+      </w:r>
+    </w:p>
+    <w:tbl>
+      <w:tblPr>
+        <w:tblW w:type="dxa" w:w="9000"/>
+        <w:tblBorders>
+          <w:top w:val="single" w:color="auto" w:sz="4"/>
+          <w:left w:val="single" w:color="auto" w:sz="4"/>
+          <w:bottom w:val="single" w:color="auto" w:sz="4"/>
+          <w:right w:val="single" w:color="auto" w:sz="4"/>
+          <w:insideH w:val="single" w:color="auto" w:sz="4"/>
+          <w:insideV w:val="single" w:color="auto" w:sz="4"/>
+        </w:tblBorders>
+      </w:tblPr>
+      <w:tblGrid>
+        <w:gridCol w:w="1200"/>
+        <w:gridCol w:w="5600"/>
+        <w:gridCol w:w="2200"/>
+      </w:tblGrid>
+      <w:tr>
+        <w:trPr>
+          <w:tblHeader/>
+        </w:trPr>
+        <w:tc>
+          <w:tcPr>
+            <w:tcW w:type="dxa" w:w="1200"/>
+            <w:shd w:fill="1F2A44" w:val="clear"/>
+            <w:tcMar>
+              <w:top w:type="dxa" w:w="70"/>
+              <w:left w:type="dxa" w:w="90"/>
+              <w:bottom w:type="dxa" w:w="70"/>
+              <w:right w:type="dxa" w:w="90"/>
+            </w:tcMar>
+          </w:tcPr>
+          <w:p>
+            <w:r>
+              <w:rPr>
+                <w:b/>
+                <w:bCs/>
+                <w:color w:val="FFFFFF"/>
+                <w:sz w:val="18"/>
+                <w:szCs w:val="18"/>
+              </w:rPr>
+              <w:t xml:space="preserve">Story ID</w:t>
+            </w:r>
+          </w:p>
+        </w:tc>
+        <w:tc>
+          <w:tcPr>
+            <w:tcW w:type="dxa" w:w="5600"/>
+            <w:shd w:fill="1F2A44" w:val="clear"/>
+            <w:tcMar>
+              <w:top w:type="dxa" w:w="70"/>
+              <w:left w:type="dxa" w:w="90"/>
+              <w:bottom w:type="dxa" w:w="70"/>
+              <w:right w:type="dxa" w:w="90"/>
+            </w:tcMar>
+          </w:tcPr>
+          <w:p>
+            <w:r>
+              <w:rPr>
+                <w:b/>
+                <w:bCs/>
+                <w:color w:val="FFFFFF"/>
+                <w:sz w:val="18"/>
+                <w:szCs w:val="18"/>
+              </w:rPr>
+              <w:t xml:space="preserve">Nội dung cập nhật</w:t>
+            </w:r>
+          </w:p>
+        </w:tc>
+        <w:tc>
+          <w:tcPr>
+            <w:tcW w:type="dxa" w:w="2200"/>
+            <w:shd w:fill="1F2A44" w:val="clear"/>
+            <w:tcMar>
+              <w:top w:type="dxa" w:w="70"/>
+              <w:left w:type="dxa" w:w="90"/>
+              <w:bottom w:type="dxa" w:w="70"/>
+              <w:right w:type="dxa" w:w="90"/>
+            </w:tcMar>
+          </w:tcPr>
+          <w:p>
+            <w:r>
+              <w:rPr>
+                <w:b/>
+                <w:bCs/>
+                <w:color w:val="FFFFFF"/>
+                <w:sz w:val="18"/>
+                <w:szCs w:val="18"/>
+              </w:rPr>
+              <w:t xml:space="preserve">Trạng thái</w:t>
+            </w:r>
+          </w:p>
+        </w:tc>
+      </w:tr>
+      <w:tr>
+        <w:tc>
+          <w:tcPr>
+            <w:tcW w:type="dxa" w:w="1200"/>
+            <w:tcMar>
+              <w:top w:type="dxa" w:w="70"/>
+              <w:left w:type="dxa" w:w="90"/>
+              <w:bottom w:type="dxa" w:w="70"/>
+              <w:right w:type="dxa" w:w="90"/>
+            </w:tcMar>
+          </w:tcPr>
+          <w:p>
+            <w:r>
+              <w:rPr>
+                <w:b w:val="false"/>
+                <w:bCs w:val="false"/>
+                <w:sz w:val="18"/>
+                <w:szCs w:val="18"/>
+              </w:rPr>
+              <w:t xml:space="preserve">S6-03</w:t>
+            </w:r>
+          </w:p>
+        </w:tc>
+        <w:tc>
+          <w:tcPr>
+            <w:tcW w:type="dxa" w:w="5600"/>
+            <w:tcMar>
+              <w:top w:type="dxa" w:w="70"/>
+              <w:left w:type="dxa" w:w="90"/>
+              <w:bottom w:type="dxa" w:w="70"/>
+              <w:right w:type="dxa" w:w="90"/>
+            </w:tcMar>
+          </w:tcPr>
+          <w:p>
+            <w:r>
+              <w:rPr>
+                <w:b w:val="false"/>
+                <w:bCs w:val="false"/>
+                <w:sz w:val="18"/>
+                <w:szCs w:val="18"/>
+              </w:rPr>
+              <w:t xml:space="preserve">occupations (thông tin nhận diện + document) và occupation_reviews; số liệu là Fact gắn occupation_id với reference_period, bắt buộc có quốc gia; không có bảng labour_market_items riêng. Quyền labour.manage. Migration 20260925090000_labour_market.</w:t>
+            </w:r>
+          </w:p>
+        </w:tc>
+        <w:tc>
+          <w:tcPr>
+            <w:tcW w:type="dxa" w:w="2200"/>
+            <w:tcMar>
+              <w:top w:type="dxa" w:w="70"/>
+              <w:left w:type="dxa" w:w="90"/>
+              <w:bottom w:type="dxa" w:w="70"/>
+              <w:right w:type="dxa" w:w="90"/>
+            </w:tcMar>
+          </w:tcPr>
+          <w:p>
+            <w:r>
+              <w:rPr>
+                <w:b w:val="false"/>
+                <w:bCs w:val="false"/>
+                <w:sz w:val="18"/>
+                <w:szCs w:val="18"/>
+              </w:rPr>
+              <w:t xml:space="preserve">Đã code + test tự động; chờ apply migration lên Supabase</w:t>
+            </w:r>
+          </w:p>
+        </w:tc>
+      </w:tr>
+      <w:tr>
+        <w:tc>
+          <w:tcPr>
+            <w:tcW w:type="dxa" w:w="1200"/>
+            <w:tcMar>
+              <w:top w:type="dxa" w:w="70"/>
+              <w:left w:type="dxa" w:w="90"/>
+              <w:bottom w:type="dxa" w:w="70"/>
+              <w:right w:type="dxa" w:w="90"/>
+            </w:tcMar>
+          </w:tcPr>
+          <w:p>
+            <w:r>
+              <w:rPr>
+                <w:b w:val="false"/>
+                <w:bCs w:val="false"/>
+                <w:sz w:val="18"/>
+                <w:szCs w:val="18"/>
+              </w:rPr>
+              <w:t xml:space="preserve">S6-04</w:t>
+            </w:r>
+          </w:p>
+        </w:tc>
+        <w:tc>
+          <w:tcPr>
+            <w:tcW w:type="dxa" w:w="5600"/>
+            <w:tcMar>
+              <w:top w:type="dxa" w:w="70"/>
+              <w:left w:type="dxa" w:w="90"/>
+              <w:bottom w:type="dxa" w:w="70"/>
+              <w:right w:type="dxa" w:w="90"/>
+            </w:tcMar>
+          </w:tcPr>
+          <w:p>
+            <w:r>
+              <w:rPr>
+                <w:b w:val="false"/>
+                <w:bCs w:val="false"/>
+                <w:sz w:val="18"/>
+                <w:szCs w:val="18"/>
+              </w:rPr>
+              <w:t xml:space="preserve">/occupations (tìm kiếm, phân trang) và /occupations/[id] (lọc số liệu theo quốc gia, kỳ số liệu, nhãn nguồn không chính thức, cảnh báo mâu thuẫn); chỉ hiện số liệu có nguồn đã verified.</w:t>
+            </w:r>
+          </w:p>
+        </w:tc>
+        <w:tc>
+          <w:tcPr>
+            <w:tcW w:type="dxa" w:w="2200"/>
+            <w:tcMar>
+              <w:top w:type="dxa" w:w="70"/>
+              <w:left w:type="dxa" w:w="90"/>
+              <w:bottom w:type="dxa" w:w="70"/>
+              <w:right w:type="dxa" w:w="90"/>
+            </w:tcMar>
+          </w:tcPr>
+          <w:p>
+            <w:r>
+              <w:rPr>
+                <w:b w:val="false"/>
+                <w:bCs w:val="false"/>
+                <w:sz w:val="18"/>
+                <w:szCs w:val="18"/>
+              </w:rPr>
+              <w:t xml:space="preserve">Đã code + test tự động; chờ apply migration lên Supabase</w:t>
+            </w:r>
+          </w:p>
+        </w:tc>
+      </w:tr>
+      <w:tr>
+        <w:tc>
+          <w:tcPr>
+            <w:tcW w:type="dxa" w:w="1200"/>
+            <w:tcMar>
+              <w:top w:type="dxa" w:w="70"/>
+              <w:left w:type="dxa" w:w="90"/>
+              <w:bottom w:type="dxa" w:w="70"/>
+              <w:right w:type="dxa" w:w="90"/>
+            </w:tcMar>
+          </w:tcPr>
+          <w:p>
+            <w:r>
+              <w:rPr>
+                <w:b w:val="false"/>
+                <w:bCs w:val="false"/>
+                <w:sz w:val="18"/>
+                <w:szCs w:val="18"/>
+              </w:rPr>
+              <w:t xml:space="preserve">S6-07 (mới)</w:t>
+            </w:r>
+          </w:p>
+        </w:tc>
+        <w:tc>
+          <w:tcPr>
+            <w:tcW w:type="dxa" w:w="5600"/>
+            <w:tcMar>
+              <w:top w:type="dxa" w:w="70"/>
+              <w:left w:type="dxa" w:w="90"/>
+              <w:bottom w:type="dxa" w:w="70"/>
+              <w:right w:type="dxa" w:w="90"/>
+            </w:tcMar>
+          </w:tcPr>
+          <w:p>
+            <w:r>
+              <w:rPr>
+                <w:b w:val="false"/>
+                <w:bCs w:val="false"/>
+                <w:sz w:val="18"/>
+                <w:szCs w:val="18"/>
+              </w:rPr>
+              <w:t xml:space="preserve">Workspace /labour/workspace: đề xuất (labour.manage) và duyệt (facts.review) nghề, tab trạng thái.</w:t>
+            </w:r>
+          </w:p>
+        </w:tc>
+        <w:tc>
+          <w:tcPr>
+            <w:tcW w:type="dxa" w:w="2200"/>
+            <w:tcMar>
+              <w:top w:type="dxa" w:w="70"/>
+              <w:left w:type="dxa" w:w="90"/>
+              <w:bottom w:type="dxa" w:w="70"/>
+              <w:right w:type="dxa" w:w="90"/>
+            </w:tcMar>
+          </w:tcPr>
+          <w:p>
+            <w:r>
+              <w:rPr>
+                <w:b w:val="false"/>
+                <w:bCs w:val="false"/>
+                <w:sz w:val="18"/>
+                <w:szCs w:val="18"/>
+              </w:rPr>
+              <w:t xml:space="preserve">Đã code + test tự động; chờ apply migration lên Supabase</w:t>
+            </w:r>
+          </w:p>
+        </w:tc>
+      </w:tr>
+    </w:tbl>
+    <w:p>
+      <w:pPr>
+        <w:spacing w:after="120"/>
+      </w:pPr>
+      <w:r>
+        <w:t xml:space="preserve">Cập nhật v0.5 – 2026-09-26: Slice 7 (Search, Country Comparison).</w:t>
+      </w:r>
+    </w:p>
+    <w:tbl>
+      <w:tblPr>
+        <w:tblW w:type="dxa" w:w="9000"/>
+        <w:tblBorders>
+          <w:top w:val="single" w:color="auto" w:sz="4"/>
+          <w:left w:val="single" w:color="auto" w:sz="4"/>
+          <w:bottom w:val="single" w:color="auto" w:sz="4"/>
+          <w:right w:val="single" w:color="auto" w:sz="4"/>
+          <w:insideH w:val="single" w:color="auto" w:sz="4"/>
+          <w:insideV w:val="single" w:color="auto" w:sz="4"/>
+        </w:tblBorders>
+      </w:tblPr>
+      <w:tblGrid>
+        <w:gridCol w:w="1200"/>
+        <w:gridCol w:w="5600"/>
+        <w:gridCol w:w="2200"/>
+      </w:tblGrid>
+      <w:tr>
+        <w:trPr>
+          <w:tblHeader/>
+        </w:trPr>
+        <w:tc>
+          <w:tcPr>
+            <w:tcW w:type="dxa" w:w="1200"/>
+            <w:shd w:fill="1F2A44" w:val="clear"/>
+            <w:tcMar>
+              <w:top w:type="dxa" w:w="70"/>
+              <w:left w:type="dxa" w:w="90"/>
+              <w:bottom w:type="dxa" w:w="70"/>
+              <w:right w:type="dxa" w:w="90"/>
+            </w:tcMar>
+          </w:tcPr>
+          <w:p>
+            <w:r>
+              <w:rPr>
+                <w:b/>
+                <w:bCs/>
+                <w:color w:val="FFFFFF"/>
+                <w:sz w:val="18"/>
+                <w:szCs w:val="18"/>
+              </w:rPr>
+              <w:t xml:space="preserve">Story ID</w:t>
+            </w:r>
+          </w:p>
+        </w:tc>
+        <w:tc>
+          <w:tcPr>
+            <w:tcW w:type="dxa" w:w="5600"/>
+            <w:shd w:fill="1F2A44" w:val="clear"/>
+            <w:tcMar>
+              <w:top w:type="dxa" w:w="70"/>
+              <w:left w:type="dxa" w:w="90"/>
+              <w:bottom w:type="dxa" w:w="70"/>
+              <w:right w:type="dxa" w:w="90"/>
+            </w:tcMar>
+          </w:tcPr>
+          <w:p>
+            <w:r>
+              <w:rPr>
+                <w:b/>
+                <w:bCs/>
+                <w:color w:val="FFFFFF"/>
+                <w:sz w:val="18"/>
+                <w:szCs w:val="18"/>
+              </w:rPr>
+              <w:t xml:space="preserve">Nội dung cập nhật</w:t>
+            </w:r>
+          </w:p>
+        </w:tc>
+        <w:tc>
+          <w:tcPr>
+            <w:tcW w:type="dxa" w:w="2200"/>
+            <w:shd w:fill="1F2A44" w:val="clear"/>
+            <w:tcMar>
+              <w:top w:type="dxa" w:w="70"/>
+              <w:left w:type="dxa" w:w="90"/>
+              <w:bottom w:type="dxa" w:w="70"/>
+              <w:right w:type="dxa" w:w="90"/>
+            </w:tcMar>
+          </w:tcPr>
+          <w:p>
+            <w:r>
+              <w:rPr>
+                <w:b/>
+                <w:bCs/>
+                <w:color w:val="FFFFFF"/>
+                <w:sz w:val="18"/>
+                <w:szCs w:val="18"/>
+              </w:rPr>
+              <w:t xml:space="preserve">Trạng thái</w:t>
+            </w:r>
+          </w:p>
+        </w:tc>
+      </w:tr>
+      <w:tr>
+        <w:tc>
+          <w:tcPr>
+            <w:tcW w:type="dxa" w:w="1200"/>
+            <w:tcMar>
+              <w:top w:type="dxa" w:w="70"/>
+              <w:left w:type="dxa" w:w="90"/>
+              <w:bottom w:type="dxa" w:w="70"/>
+              <w:right w:type="dxa" w:w="90"/>
+            </w:tcMar>
+          </w:tcPr>
+          <w:p>
+            <w:r>
+              <w:rPr>
+                <w:b w:val="false"/>
+                <w:bCs w:val="false"/>
+                <w:sz w:val="18"/>
+                <w:szCs w:val="18"/>
+              </w:rPr>
+              <w:t xml:space="preserve">S7-01</w:t>
+            </w:r>
+          </w:p>
+        </w:tc>
+        <w:tc>
+          <w:tcPr>
+            <w:tcW w:type="dxa" w:w="5600"/>
+            <w:tcMar>
+              <w:top w:type="dxa" w:w="70"/>
+              <w:left w:type="dxa" w:w="90"/>
+              <w:bottom w:type="dxa" w:w="70"/>
+              <w:right w:type="dxa" w:w="90"/>
+            </w:tcMar>
+          </w:tcPr>
+          <w:p>
+            <w:r>
+              <w:rPr>
+                <w:b w:val="false"/>
+                <w:bCs w:val="false"/>
+                <w:sz w:val="18"/>
+                <w:szCs w:val="18"/>
+              </w:rPr>
+              <w:t xml:space="preserve">Full-text search PostgreSQL: cột search_vector (generated) + index GIN trên 8 bảng; hàm search_fold bỏ dấu; RPC search_public (SECURITY INVOKER). Migration 20260926090000_search.</w:t>
+            </w:r>
+          </w:p>
+        </w:tc>
+        <w:tc>
+          <w:tcPr>
+            <w:tcW w:type="dxa" w:w="2200"/>
+            <w:tcMar>
+              <w:top w:type="dxa" w:w="70"/>
+              <w:left w:type="dxa" w:w="90"/>
+              <w:bottom w:type="dxa" w:w="70"/>
+              <w:right w:type="dxa" w:w="90"/>
+            </w:tcMar>
+          </w:tcPr>
+          <w:p>
+            <w:r>
+              <w:rPr>
+                <w:b w:val="false"/>
+                <w:bCs w:val="false"/>
+                <w:sz w:val="18"/>
+                <w:szCs w:val="18"/>
+              </w:rPr>
+              <w:t xml:space="preserve">Đã code + test tự động; chờ apply migration lên Supabase</w:t>
+            </w:r>
+          </w:p>
+        </w:tc>
+      </w:tr>
+      <w:tr>
+        <w:tc>
+          <w:tcPr>
+            <w:tcW w:type="dxa" w:w="1200"/>
+            <w:tcMar>
+              <w:top w:type="dxa" w:w="70"/>
+              <w:left w:type="dxa" w:w="90"/>
+              <w:bottom w:type="dxa" w:w="70"/>
+              <w:right w:type="dxa" w:w="90"/>
+            </w:tcMar>
+          </w:tcPr>
+          <w:p>
+            <w:r>
+              <w:rPr>
+                <w:b w:val="false"/>
+                <w:bCs w:val="false"/>
+                <w:sz w:val="18"/>
+                <w:szCs w:val="18"/>
+              </w:rPr>
+              <w:t xml:space="preserve">S7-02</w:t>
+            </w:r>
+          </w:p>
+        </w:tc>
+        <w:tc>
+          <w:tcPr>
+            <w:tcW w:type="dxa" w:w="5600"/>
+            <w:tcMar>
+              <w:top w:type="dxa" w:w="70"/>
+              <w:left w:type="dxa" w:w="90"/>
+              <w:bottom w:type="dxa" w:w="70"/>
+              <w:right w:type="dxa" w:w="90"/>
+            </w:tcMar>
+          </w:tcPr>
+          <w:p>
+            <w:r>
+              <w:rPr>
+                <w:b w:val="false"/>
+                <w:bCs w:val="false"/>
+                <w:sz w:val="18"/>
+                <w:szCs w:val="18"/>
+              </w:rPr>
+              <w:t xml:space="preserve">/search: kết quả chia nhóm theo loại, tối đa 5 mục mỗi nhóm kèm tổng số và link "See all"; nút tìm kiếm trên header; chỉ dữ liệu công khai.</w:t>
+            </w:r>
+          </w:p>
+        </w:tc>
+        <w:tc>
+          <w:tcPr>
+            <w:tcW w:type="dxa" w:w="2200"/>
+            <w:tcMar>
+              <w:top w:type="dxa" w:w="70"/>
+              <w:left w:type="dxa" w:w="90"/>
+              <w:bottom w:type="dxa" w:w="70"/>
+              <w:right w:type="dxa" w:w="90"/>
+            </w:tcMar>
+          </w:tcPr>
+          <w:p>
+            <w:r>
+              <w:rPr>
+                <w:b w:val="false"/>
+                <w:bCs w:val="false"/>
+                <w:sz w:val="18"/>
+                <w:szCs w:val="18"/>
+              </w:rPr>
+              <w:t xml:space="preserve">Đã code + test tự động; chờ apply migration lên Supabase</w:t>
+            </w:r>
+          </w:p>
+        </w:tc>
+      </w:tr>
+      <w:tr>
+        <w:tc>
+          <w:tcPr>
+            <w:tcW w:type="dxa" w:w="1200"/>
+            <w:tcMar>
+              <w:top w:type="dxa" w:w="70"/>
+              <w:left w:type="dxa" w:w="90"/>
+              <w:bottom w:type="dxa" w:w="70"/>
+              <w:right w:type="dxa" w:w="90"/>
+            </w:tcMar>
+          </w:tcPr>
+          <w:p>
+            <w:r>
+              <w:rPr>
+                <w:b w:val="false"/>
+                <w:bCs w:val="false"/>
+                <w:sz w:val="18"/>
+                <w:szCs w:val="18"/>
+              </w:rPr>
+              <w:t xml:space="preserve">S7-03</w:t>
+            </w:r>
+          </w:p>
+        </w:tc>
+        <w:tc>
+          <w:tcPr>
+            <w:tcW w:type="dxa" w:w="5600"/>
+            <w:tcMar>
+              <w:top w:type="dxa" w:w="70"/>
+              <w:left w:type="dxa" w:w="90"/>
+              <w:bottom w:type="dxa" w:w="70"/>
+              <w:right w:type="dxa" w:w="90"/>
+            </w:tcMar>
+          </w:tcPr>
+          <w:p>
+            <w:r>
+              <w:rPr>
+                <w:b w:val="false"/>
+                <w:bCs w:val="false"/>
+                <w:sz w:val="18"/>
+                <w:szCs w:val="18"/>
+              </w:rPr>
+              <w:t xml:space="preserve">/compare: chọn 2–5 quốc gia; chỉ số theo nhóm, quy định nhập cư theo loại, số liệu theo nghề, số mục giáo dục đã duyệt. Migration 20260926100000_comparison_metrics.</w:t>
+            </w:r>
+          </w:p>
+        </w:tc>
+        <w:tc>
+          <w:tcPr>
+            <w:tcW w:type="dxa" w:w="2200"/>
+            <w:tcMar>
+              <w:top w:type="dxa" w:w="70"/>
+              <w:left w:type="dxa" w:w="90"/>
+              <w:bottom w:type="dxa" w:w="70"/>
+              <w:right w:type="dxa" w:w="90"/>
+            </w:tcMar>
+          </w:tcPr>
+          <w:p>
+            <w:r>
+              <w:rPr>
+                <w:b w:val="false"/>
+                <w:bCs w:val="false"/>
+                <w:sz w:val="18"/>
+                <w:szCs w:val="18"/>
+              </w:rPr>
+              <w:t xml:space="preserve">Đã code + test tự động; chờ apply migration lên Supabase</w:t>
+            </w:r>
+          </w:p>
+        </w:tc>
+      </w:tr>
+      <w:tr>
+        <w:tc>
+          <w:tcPr>
+            <w:tcW w:type="dxa" w:w="1200"/>
+            <w:tcMar>
+              <w:top w:type="dxa" w:w="70"/>
+              <w:left w:type="dxa" w:w="90"/>
+              <w:bottom w:type="dxa" w:w="70"/>
+              <w:right w:type="dxa" w:w="90"/>
+            </w:tcMar>
+          </w:tcPr>
+          <w:p>
+            <w:r>
+              <w:rPr>
+                <w:b w:val="false"/>
+                <w:bCs w:val="false"/>
+                <w:sz w:val="18"/>
+                <w:szCs w:val="18"/>
+              </w:rPr>
+              <w:t xml:space="preserve">S7-04</w:t>
+            </w:r>
+          </w:p>
+        </w:tc>
+        <w:tc>
+          <w:tcPr>
+            <w:tcW w:type="dxa" w:w="5600"/>
+            <w:tcMar>
+              <w:top w:type="dxa" w:w="70"/>
+              <w:left w:type="dxa" w:w="90"/>
+              <w:bottom w:type="dxa" w:w="70"/>
+              <w:right w:type="dxa" w:w="90"/>
+            </w:tcMar>
+          </w:tcPr>
+          <w:p>
+            <w:r>
+              <w:rPr>
+                <w:b w:val="false"/>
+                <w:bCs w:val="false"/>
+                <w:sz w:val="18"/>
+                <w:szCs w:val="18"/>
+              </w:rPr>
+              <w:t xml:space="preserve">Mỗi ô so sánh hiển thị giá trị + nguồn + tier + kỳ số liệu + ngày thu thập + link nguồn; mâu thuẫn được đánh dấu; không có điểm tổng hợp.</w:t>
+            </w:r>
+          </w:p>
+        </w:tc>
+        <w:tc>
+          <w:tcPr>
+            <w:tcW w:type="dxa" w:w="2200"/>
+            <w:tcMar>
+              <w:top w:type="dxa" w:w="70"/>
+              <w:left w:type="dxa" w:w="90"/>
+              <w:bottom w:type="dxa" w:w="70"/>
+              <w:right w:type="dxa" w:w="90"/>
+            </w:tcMar>
+          </w:tcPr>
+          <w:p>
+            <w:r>
+              <w:rPr>
+                <w:b w:val="false"/>
+                <w:bCs w:val="false"/>
+                <w:sz w:val="18"/>
+                <w:szCs w:val="18"/>
+              </w:rPr>
+              <w:t xml:space="preserve">Đã code + test tự động; chờ apply migration lên Supabase</w:t>
+            </w:r>
+          </w:p>
+        </w:tc>
+      </w:tr>
+      <w:tr>
+        <w:tc>
+          <w:tcPr>
+            <w:tcW w:type="dxa" w:w="1200"/>
+            <w:tcMar>
+              <w:top w:type="dxa" w:w="70"/>
+              <w:left w:type="dxa" w:w="90"/>
+              <w:bottom w:type="dxa" w:w="70"/>
+              <w:right w:type="dxa" w:w="90"/>
+            </w:tcMar>
+          </w:tcPr>
+          <w:p>
+            <w:r>
+              <w:rPr>
+                <w:b w:val="false"/>
+                <w:bCs w:val="false"/>
+                <w:sz w:val="18"/>
+                <w:szCs w:val="18"/>
+              </w:rPr>
+              <w:t xml:space="preserve">S7-05 (mới)</w:t>
+            </w:r>
+          </w:p>
+        </w:tc>
+        <w:tc>
+          <w:tcPr>
+            <w:tcW w:type="dxa" w:w="5600"/>
+            <w:tcMar>
+              <w:top w:type="dxa" w:w="70"/>
+              <w:left w:type="dxa" w:w="90"/>
+              <w:bottom w:type="dxa" w:w="70"/>
+              <w:right w:type="dxa" w:w="90"/>
+            </w:tcMar>
+          </w:tcPr>
+          <w:p>
+            <w:r>
+              <w:rPr>
+                <w:b w:val="false"/>
+                <w:bCs w:val="false"/>
+                <w:sz w:val="18"/>
+                <w:szCs w:val="18"/>
+              </w:rPr>
+              <w:t xml:space="preserve">/admin/metrics: quản trị viên định nghĩa chỉ số so sánh (quyền metrics.manage); form fact có ô chọn chỉ số.</w:t>
             </w:r>
           </w:p>
         </w:tc>

</xml_diff>

<commit_message>
Add research workspace (Slice 8), crawler (Slice 9) and the user guide
Slice 8: owner-only research projects, bookmarks with real foreign keys,
notes and My Europe Plan, with RLS, account-deletion cascade and a
"delete my workspace" action.

Slice 9: crawler package (Crawlee BasicCrawler) that fetches only URLs
registered per approved source, respects robots.txt and rate limits, and
records documents through five SQL functions as the least-privilege
nordic_crawler_ops role (no service-role key). Text-hash change detection,
private extracted text, crawl run logs, /admin/crawler, a "source changed"
review queue with warnings on affected facts, and a weekly GitHub Actions
workflow that skips when CRAWLER_DATABASE_URL is not configured.

Also: User Guide v1.1, architecture/learning docs, spec decision log and
docx v0.6/v0.7 update sections (additive only).

Co-Authored-By: Claude Opus 5.5 <noreply@anthropic.com>
</commit_message>
<xml_diff>
--- a/documents/Product_Backlog.docx
+++ b/documents/Product_Backlog.docx
@@ -10617,6 +10617,1300 @@
                 <w:szCs w:val="18"/>
               </w:rPr>
               <w:t xml:space="preserve">Đã code + test tự động; chờ apply migration lên Supabase</w:t>
+            </w:r>
+          </w:p>
+        </w:tc>
+      </w:tr>
+    </w:tbl>
+    <w:p>
+      <w:pPr>
+        <w:spacing w:after="120"/>
+      </w:pPr>
+      <w:r>
+        <w:t xml:space="preserve">Cập nhật v0.6 – 2026-09-27: Slice 8 (Research Workspace).</w:t>
+      </w:r>
+    </w:p>
+    <w:tbl>
+      <w:tblPr>
+        <w:tblW w:type="dxa" w:w="9000"/>
+        <w:tblBorders>
+          <w:top w:val="single" w:color="auto" w:sz="4"/>
+          <w:left w:val="single" w:color="auto" w:sz="4"/>
+          <w:bottom w:val="single" w:color="auto" w:sz="4"/>
+          <w:right w:val="single" w:color="auto" w:sz="4"/>
+          <w:insideH w:val="single" w:color="auto" w:sz="4"/>
+          <w:insideV w:val="single" w:color="auto" w:sz="4"/>
+        </w:tblBorders>
+      </w:tblPr>
+      <w:tblGrid>
+        <w:gridCol w:w="1200"/>
+        <w:gridCol w:w="5600"/>
+        <w:gridCol w:w="2200"/>
+      </w:tblGrid>
+      <w:tr>
+        <w:trPr>
+          <w:tblHeader/>
+        </w:trPr>
+        <w:tc>
+          <w:tcPr>
+            <w:tcW w:type="dxa" w:w="1200"/>
+            <w:shd w:fill="1F2A44" w:val="clear"/>
+            <w:tcMar>
+              <w:top w:type="dxa" w:w="70"/>
+              <w:left w:type="dxa" w:w="90"/>
+              <w:bottom w:type="dxa" w:w="70"/>
+              <w:right w:type="dxa" w:w="90"/>
+            </w:tcMar>
+          </w:tcPr>
+          <w:p>
+            <w:r>
+              <w:rPr>
+                <w:b/>
+                <w:bCs/>
+                <w:color w:val="FFFFFF"/>
+                <w:sz w:val="18"/>
+                <w:szCs w:val="18"/>
+              </w:rPr>
+              <w:t xml:space="preserve">Story ID</w:t>
+            </w:r>
+          </w:p>
+        </w:tc>
+        <w:tc>
+          <w:tcPr>
+            <w:tcW w:type="dxa" w:w="5600"/>
+            <w:shd w:fill="1F2A44" w:val="clear"/>
+            <w:tcMar>
+              <w:top w:type="dxa" w:w="70"/>
+              <w:left w:type="dxa" w:w="90"/>
+              <w:bottom w:type="dxa" w:w="70"/>
+              <w:right w:type="dxa" w:w="90"/>
+            </w:tcMar>
+          </w:tcPr>
+          <w:p>
+            <w:r>
+              <w:rPr>
+                <w:b/>
+                <w:bCs/>
+                <w:color w:val="FFFFFF"/>
+                <w:sz w:val="18"/>
+                <w:szCs w:val="18"/>
+              </w:rPr>
+              <w:t xml:space="preserve">Nội dung cập nhật</w:t>
+            </w:r>
+          </w:p>
+        </w:tc>
+        <w:tc>
+          <w:tcPr>
+            <w:tcW w:type="dxa" w:w="2200"/>
+            <w:shd w:fill="1F2A44" w:val="clear"/>
+            <w:tcMar>
+              <w:top w:type="dxa" w:w="70"/>
+              <w:left w:type="dxa" w:w="90"/>
+              <w:bottom w:type="dxa" w:w="70"/>
+              <w:right w:type="dxa" w:w="90"/>
+            </w:tcMar>
+          </w:tcPr>
+          <w:p>
+            <w:r>
+              <w:rPr>
+                <w:b/>
+                <w:bCs/>
+                <w:color w:val="FFFFFF"/>
+                <w:sz w:val="18"/>
+                <w:szCs w:val="18"/>
+              </w:rPr>
+              <w:t xml:space="preserve">Trạng thái</w:t>
+            </w:r>
+          </w:p>
+        </w:tc>
+      </w:tr>
+      <w:tr>
+        <w:tc>
+          <w:tcPr>
+            <w:tcW w:type="dxa" w:w="1200"/>
+            <w:tcMar>
+              <w:top w:type="dxa" w:w="70"/>
+              <w:left w:type="dxa" w:w="90"/>
+              <w:bottom w:type="dxa" w:w="70"/>
+              <w:right w:type="dxa" w:w="90"/>
+            </w:tcMar>
+          </w:tcPr>
+          <w:p>
+            <w:r>
+              <w:rPr>
+                <w:b w:val="false"/>
+                <w:bCs w:val="false"/>
+                <w:sz w:val="18"/>
+                <w:szCs w:val="18"/>
+              </w:rPr>
+              <w:t xml:space="preserve">S8-01</w:t>
+            </w:r>
+          </w:p>
+        </w:tc>
+        <w:tc>
+          <w:tcPr>
+            <w:tcW w:type="dxa" w:w="5600"/>
+            <w:tcMar>
+              <w:top w:type="dxa" w:w="70"/>
+              <w:left w:type="dxa" w:w="90"/>
+              <w:bottom w:type="dxa" w:w="70"/>
+              <w:right w:type="dxa" w:w="90"/>
+            </w:tcMar>
+          </w:tcPr>
+          <w:p>
+            <w:r>
+              <w:rPr>
+                <w:b w:val="false"/>
+                <w:bCs w:val="false"/>
+                <w:sz w:val="18"/>
+                <w:szCs w:val="18"/>
+              </w:rPr>
+              <w:t xml:space="preserve">Migration research_projects, research_project_countries, saved_items, notes, user_plans, user_plan_countries (personal_plans gộp vào research_projects). Migration 20260927090000_research_workspace.</w:t>
+            </w:r>
+          </w:p>
+        </w:tc>
+        <w:tc>
+          <w:tcPr>
+            <w:tcW w:type="dxa" w:w="2200"/>
+            <w:tcMar>
+              <w:top w:type="dxa" w:w="70"/>
+              <w:left w:type="dxa" w:w="90"/>
+              <w:bottom w:type="dxa" w:w="70"/>
+              <w:right w:type="dxa" w:w="90"/>
+            </w:tcMar>
+          </w:tcPr>
+          <w:p>
+            <w:r>
+              <w:rPr>
+                <w:b w:val="false"/>
+                <w:bCs w:val="false"/>
+                <w:sz w:val="18"/>
+                <w:szCs w:val="18"/>
+              </w:rPr>
+              <w:t xml:space="preserve">Đã code + test tự động; chờ apply migration lên Supabase</w:t>
+            </w:r>
+          </w:p>
+        </w:tc>
+      </w:tr>
+      <w:tr>
+        <w:tc>
+          <w:tcPr>
+            <w:tcW w:type="dxa" w:w="1200"/>
+            <w:tcMar>
+              <w:top w:type="dxa" w:w="70"/>
+              <w:left w:type="dxa" w:w="90"/>
+              <w:bottom w:type="dxa" w:w="70"/>
+              <w:right w:type="dxa" w:w="90"/>
+            </w:tcMar>
+          </w:tcPr>
+          <w:p>
+            <w:r>
+              <w:rPr>
+                <w:b w:val="false"/>
+                <w:bCs w:val="false"/>
+                <w:sz w:val="18"/>
+                <w:szCs w:val="18"/>
+              </w:rPr>
+              <w:t xml:space="preserve">S8-02</w:t>
+            </w:r>
+          </w:p>
+        </w:tc>
+        <w:tc>
+          <w:tcPr>
+            <w:tcW w:type="dxa" w:w="5600"/>
+            <w:tcMar>
+              <w:top w:type="dxa" w:w="70"/>
+              <w:left w:type="dxa" w:w="90"/>
+              <w:bottom w:type="dxa" w:w="70"/>
+              <w:right w:type="dxa" w:w="90"/>
+            </w:tcMar>
+          </w:tcPr>
+          <w:p>
+            <w:r>
+              <w:rPr>
+                <w:b w:val="false"/>
+                <w:bCs w:val="false"/>
+                <w:sz w:val="18"/>
+                <w:szCs w:val="18"/>
+              </w:rPr>
+              <w:t xml:space="preserve">RLS chỉ chủ sở hữu trên cả 6 bảng; chỉ gắn được mục công khai và project của mình; test gồm cả trường hợp admin không đọc được dữ liệu người khác.</w:t>
+            </w:r>
+          </w:p>
+        </w:tc>
+        <w:tc>
+          <w:tcPr>
+            <w:tcW w:type="dxa" w:w="2200"/>
+            <w:tcMar>
+              <w:top w:type="dxa" w:w="70"/>
+              <w:left w:type="dxa" w:w="90"/>
+              <w:bottom w:type="dxa" w:w="70"/>
+              <w:right w:type="dxa" w:w="90"/>
+            </w:tcMar>
+          </w:tcPr>
+          <w:p>
+            <w:r>
+              <w:rPr>
+                <w:b w:val="false"/>
+                <w:bCs w:val="false"/>
+                <w:sz w:val="18"/>
+                <w:szCs w:val="18"/>
+              </w:rPr>
+              <w:t xml:space="preserve">Đã code + test tự động; chờ apply migration lên Supabase</w:t>
+            </w:r>
+          </w:p>
+        </w:tc>
+      </w:tr>
+      <w:tr>
+        <w:tc>
+          <w:tcPr>
+            <w:tcW w:type="dxa" w:w="1200"/>
+            <w:tcMar>
+              <w:top w:type="dxa" w:w="70"/>
+              <w:left w:type="dxa" w:w="90"/>
+              <w:bottom w:type="dxa" w:w="70"/>
+              <w:right w:type="dxa" w:w="90"/>
+            </w:tcMar>
+          </w:tcPr>
+          <w:p>
+            <w:r>
+              <w:rPr>
+                <w:b w:val="false"/>
+                <w:bCs w:val="false"/>
+                <w:sz w:val="18"/>
+                <w:szCs w:val="18"/>
+              </w:rPr>
+              <w:t xml:space="preserve">S8-03</w:t>
+            </w:r>
+          </w:p>
+        </w:tc>
+        <w:tc>
+          <w:tcPr>
+            <w:tcW w:type="dxa" w:w="5600"/>
+            <w:tcMar>
+              <w:top w:type="dxa" w:w="70"/>
+              <w:left w:type="dxa" w:w="90"/>
+              <w:bottom w:type="dxa" w:w="70"/>
+              <w:right w:type="dxa" w:w="90"/>
+            </w:tcMar>
+          </w:tcPr>
+          <w:p>
+            <w:r>
+              <w:rPr>
+                <w:b w:val="false"/>
+                <w:bCs w:val="false"/>
+                <w:sz w:val="18"/>
+                <w:szCs w:val="18"/>
+              </w:rPr>
+              <w:t xml:space="preserve">/workspace và /workspace/projects/[id]: tạo, sửa, lưu trữ, xóa project; quốc gia mục tiêu kèm lối tắt so sánh.</w:t>
+            </w:r>
+          </w:p>
+        </w:tc>
+        <w:tc>
+          <w:tcPr>
+            <w:tcW w:type="dxa" w:w="2200"/>
+            <w:tcMar>
+              <w:top w:type="dxa" w:w="70"/>
+              <w:left w:type="dxa" w:w="90"/>
+              <w:bottom w:type="dxa" w:w="70"/>
+              <w:right w:type="dxa" w:w="90"/>
+            </w:tcMar>
+          </w:tcPr>
+          <w:p>
+            <w:r>
+              <w:rPr>
+                <w:b w:val="false"/>
+                <w:bCs w:val="false"/>
+                <w:sz w:val="18"/>
+                <w:szCs w:val="18"/>
+              </w:rPr>
+              <w:t xml:space="preserve">Đã code + test tự động; chờ apply migration lên Supabase</w:t>
+            </w:r>
+          </w:p>
+        </w:tc>
+      </w:tr>
+      <w:tr>
+        <w:tc>
+          <w:tcPr>
+            <w:tcW w:type="dxa" w:w="1200"/>
+            <w:tcMar>
+              <w:top w:type="dxa" w:w="70"/>
+              <w:left w:type="dxa" w:w="90"/>
+              <w:bottom w:type="dxa" w:w="70"/>
+              <w:right w:type="dxa" w:w="90"/>
+            </w:tcMar>
+          </w:tcPr>
+          <w:p>
+            <w:r>
+              <w:rPr>
+                <w:b w:val="false"/>
+                <w:bCs w:val="false"/>
+                <w:sz w:val="18"/>
+                <w:szCs w:val="18"/>
+              </w:rPr>
+              <w:t xml:space="preserve">S8-04</w:t>
+            </w:r>
+          </w:p>
+        </w:tc>
+        <w:tc>
+          <w:tcPr>
+            <w:tcW w:type="dxa" w:w="5600"/>
+            <w:tcMar>
+              <w:top w:type="dxa" w:w="70"/>
+              <w:left w:type="dxa" w:w="90"/>
+              <w:bottom w:type="dxa" w:w="70"/>
+              <w:right w:type="dxa" w:w="90"/>
+            </w:tcMar>
+          </w:tcPr>
+          <w:p>
+            <w:r>
+              <w:rPr>
+                <w:b w:val="false"/>
+                <w:bCs w:val="false"/>
+                <w:sz w:val="18"/>
+                <w:szCs w:val="18"/>
+              </w:rPr>
+              <w:t xml:space="preserve">Nút ☆ Lưu trên trang quốc gia, trường, chương trình, quy định, nghề, nguồn; danh sách đã lưu theo loại, phân trang, gắn vào project, bỏ lưu.</w:t>
+            </w:r>
+          </w:p>
+        </w:tc>
+        <w:tc>
+          <w:tcPr>
+            <w:tcW w:type="dxa" w:w="2200"/>
+            <w:tcMar>
+              <w:top w:type="dxa" w:w="70"/>
+              <w:left w:type="dxa" w:w="90"/>
+              <w:bottom w:type="dxa" w:w="70"/>
+              <w:right w:type="dxa" w:w="90"/>
+            </w:tcMar>
+          </w:tcPr>
+          <w:p>
+            <w:r>
+              <w:rPr>
+                <w:b w:val="false"/>
+                <w:bCs w:val="false"/>
+                <w:sz w:val="18"/>
+                <w:szCs w:val="18"/>
+              </w:rPr>
+              <w:t xml:space="preserve">Đã code + test tự động; chờ apply migration lên Supabase</w:t>
+            </w:r>
+          </w:p>
+        </w:tc>
+      </w:tr>
+      <w:tr>
+        <w:tc>
+          <w:tcPr>
+            <w:tcW w:type="dxa" w:w="1200"/>
+            <w:tcMar>
+              <w:top w:type="dxa" w:w="70"/>
+              <w:left w:type="dxa" w:w="90"/>
+              <w:bottom w:type="dxa" w:w="70"/>
+              <w:right w:type="dxa" w:w="90"/>
+            </w:tcMar>
+          </w:tcPr>
+          <w:p>
+            <w:r>
+              <w:rPr>
+                <w:b w:val="false"/>
+                <w:bCs w:val="false"/>
+                <w:sz w:val="18"/>
+                <w:szCs w:val="18"/>
+              </w:rPr>
+              <w:t xml:space="preserve">S8-05</w:t>
+            </w:r>
+          </w:p>
+        </w:tc>
+        <w:tc>
+          <w:tcPr>
+            <w:tcW w:type="dxa" w:w="5600"/>
+            <w:tcMar>
+              <w:top w:type="dxa" w:w="70"/>
+              <w:left w:type="dxa" w:w="90"/>
+              <w:bottom w:type="dxa" w:w="70"/>
+              <w:right w:type="dxa" w:w="90"/>
+            </w:tcMar>
+          </w:tcPr>
+          <w:p>
+            <w:r>
+              <w:rPr>
+                <w:b w:val="false"/>
+                <w:bCs w:val="false"/>
+                <w:sz w:val="18"/>
+                <w:szCs w:val="18"/>
+              </w:rPr>
+              <w:t xml:space="preserve">Ghi chú gắn với project và/hoặc một mục; sửa, xóa; luôn gắn nhãn "Ghi chú của bạn".</w:t>
+            </w:r>
+          </w:p>
+        </w:tc>
+        <w:tc>
+          <w:tcPr>
+            <w:tcW w:type="dxa" w:w="2200"/>
+            <w:tcMar>
+              <w:top w:type="dxa" w:w="70"/>
+              <w:left w:type="dxa" w:w="90"/>
+              <w:bottom w:type="dxa" w:w="70"/>
+              <w:right w:type="dxa" w:w="90"/>
+            </w:tcMar>
+          </w:tcPr>
+          <w:p>
+            <w:r>
+              <w:rPr>
+                <w:b w:val="false"/>
+                <w:bCs w:val="false"/>
+                <w:sz w:val="18"/>
+                <w:szCs w:val="18"/>
+              </w:rPr>
+              <w:t xml:space="preserve">Đã code + test tự động; chờ apply migration lên Supabase</w:t>
+            </w:r>
+          </w:p>
+        </w:tc>
+      </w:tr>
+      <w:tr>
+        <w:tc>
+          <w:tcPr>
+            <w:tcW w:type="dxa" w:w="1200"/>
+            <w:tcMar>
+              <w:top w:type="dxa" w:w="70"/>
+              <w:left w:type="dxa" w:w="90"/>
+              <w:bottom w:type="dxa" w:w="70"/>
+              <w:right w:type="dxa" w:w="90"/>
+            </w:tcMar>
+          </w:tcPr>
+          <w:p>
+            <w:r>
+              <w:rPr>
+                <w:b w:val="false"/>
+                <w:bCs w:val="false"/>
+                <w:sz w:val="18"/>
+                <w:szCs w:val="18"/>
+              </w:rPr>
+              <w:t xml:space="preserve">S8-06</w:t>
+            </w:r>
+          </w:p>
+        </w:tc>
+        <w:tc>
+          <w:tcPr>
+            <w:tcW w:type="dxa" w:w="5600"/>
+            <w:tcMar>
+              <w:top w:type="dxa" w:w="70"/>
+              <w:left w:type="dxa" w:w="90"/>
+              <w:bottom w:type="dxa" w:w="70"/>
+              <w:right w:type="dxa" w:w="90"/>
+            </w:tcMar>
+          </w:tcPr>
+          <w:p>
+            <w:r>
+              <w:rPr>
+                <w:b w:val="false"/>
+                <w:bCs w:val="false"/>
+                <w:sz w:val="18"/>
+                <w:szCs w:val="18"/>
+              </w:rPr>
+              <w:t xml:space="preserve">/workspace/plan: My Europe Plan (vai trò, học vấn, bậc học, năm, ngôn ngữ, trạng thái hồ sơ, quốc gia, ngân sách tùy chọn) và lối tắt không phải khuyến nghị.</w:t>
+            </w:r>
+          </w:p>
+        </w:tc>
+        <w:tc>
+          <w:tcPr>
+            <w:tcW w:type="dxa" w:w="2200"/>
+            <w:tcMar>
+              <w:top w:type="dxa" w:w="70"/>
+              <w:left w:type="dxa" w:w="90"/>
+              <w:bottom w:type="dxa" w:w="70"/>
+              <w:right w:type="dxa" w:w="90"/>
+            </w:tcMar>
+          </w:tcPr>
+          <w:p>
+            <w:r>
+              <w:rPr>
+                <w:b w:val="false"/>
+                <w:bCs w:val="false"/>
+                <w:sz w:val="18"/>
+                <w:szCs w:val="18"/>
+              </w:rPr>
+              <w:t xml:space="preserve">Đã code + test tự động; chờ apply migration lên Supabase</w:t>
+            </w:r>
+          </w:p>
+        </w:tc>
+      </w:tr>
+      <w:tr>
+        <w:tc>
+          <w:tcPr>
+            <w:tcW w:type="dxa" w:w="1200"/>
+            <w:tcMar>
+              <w:top w:type="dxa" w:w="70"/>
+              <w:left w:type="dxa" w:w="90"/>
+              <w:bottom w:type="dxa" w:w="70"/>
+              <w:right w:type="dxa" w:w="90"/>
+            </w:tcMar>
+          </w:tcPr>
+          <w:p>
+            <w:r>
+              <w:rPr>
+                <w:b w:val="false"/>
+                <w:bCs w:val="false"/>
+                <w:sz w:val="18"/>
+                <w:szCs w:val="18"/>
+              </w:rPr>
+              <w:t xml:space="preserve">S8-07 (mới)</w:t>
+            </w:r>
+          </w:p>
+        </w:tc>
+        <w:tc>
+          <w:tcPr>
+            <w:tcW w:type="dxa" w:w="5600"/>
+            <w:tcMar>
+              <w:top w:type="dxa" w:w="70"/>
+              <w:left w:type="dxa" w:w="90"/>
+              <w:bottom w:type="dxa" w:w="70"/>
+              <w:right w:type="dxa" w:w="90"/>
+            </w:tcMar>
+          </w:tcPr>
+          <w:p>
+            <w:r>
+              <w:rPr>
+                <w:b w:val="false"/>
+                <w:bCs w:val="false"/>
+                <w:sz w:val="18"/>
+                <w:szCs w:val="18"/>
+              </w:rPr>
+              <w:t xml:space="preserve">Xóa toàn bộ dữ liệu workspace (gõ XÓA để xác nhận); dữ liệu cá nhân tự xóa khi tài khoản bị xóa.</w:t>
+            </w:r>
+          </w:p>
+        </w:tc>
+        <w:tc>
+          <w:tcPr>
+            <w:tcW w:type="dxa" w:w="2200"/>
+            <w:tcMar>
+              <w:top w:type="dxa" w:w="70"/>
+              <w:left w:type="dxa" w:w="90"/>
+              <w:bottom w:type="dxa" w:w="70"/>
+              <w:right w:type="dxa" w:w="90"/>
+            </w:tcMar>
+          </w:tcPr>
+          <w:p>
+            <w:r>
+              <w:rPr>
+                <w:b w:val="false"/>
+                <w:bCs w:val="false"/>
+                <w:sz w:val="18"/>
+                <w:szCs w:val="18"/>
+              </w:rPr>
+              <w:t xml:space="preserve">Đã code + test tự động; chờ apply migration lên Supabase</w:t>
+            </w:r>
+          </w:p>
+        </w:tc>
+      </w:tr>
+    </w:tbl>
+    <w:p>
+      <w:pPr>
+        <w:spacing w:after="120"/>
+      </w:pPr>
+      <w:r>
+        <w:t xml:space="preserve">Cập nhật v0.7 – 2026-09-25: Slice 9 (Crawler).</w:t>
+      </w:r>
+    </w:p>
+    <w:tbl>
+      <w:tblPr>
+        <w:tblW w:type="dxa" w:w="9000"/>
+        <w:tblBorders>
+          <w:top w:val="single" w:color="auto" w:sz="4"/>
+          <w:left w:val="single" w:color="auto" w:sz="4"/>
+          <w:bottom w:val="single" w:color="auto" w:sz="4"/>
+          <w:right w:val="single" w:color="auto" w:sz="4"/>
+          <w:insideH w:val="single" w:color="auto" w:sz="4"/>
+          <w:insideV w:val="single" w:color="auto" w:sz="4"/>
+        </w:tblBorders>
+      </w:tblPr>
+      <w:tblGrid>
+        <w:gridCol w:w="1200"/>
+        <w:gridCol w:w="5600"/>
+        <w:gridCol w:w="2200"/>
+      </w:tblGrid>
+      <w:tr>
+        <w:trPr>
+          <w:tblHeader/>
+        </w:trPr>
+        <w:tc>
+          <w:tcPr>
+            <w:tcW w:type="dxa" w:w="1200"/>
+            <w:shd w:fill="1F2A44" w:val="clear"/>
+            <w:tcMar>
+              <w:top w:type="dxa" w:w="70"/>
+              <w:left w:type="dxa" w:w="90"/>
+              <w:bottom w:type="dxa" w:w="70"/>
+              <w:right w:type="dxa" w:w="90"/>
+            </w:tcMar>
+          </w:tcPr>
+          <w:p>
+            <w:r>
+              <w:rPr>
+                <w:b/>
+                <w:bCs/>
+                <w:color w:val="FFFFFF"/>
+                <w:sz w:val="18"/>
+                <w:szCs w:val="18"/>
+              </w:rPr>
+              <w:t xml:space="preserve">Story ID</w:t>
+            </w:r>
+          </w:p>
+        </w:tc>
+        <w:tc>
+          <w:tcPr>
+            <w:tcW w:type="dxa" w:w="5600"/>
+            <w:shd w:fill="1F2A44" w:val="clear"/>
+            <w:tcMar>
+              <w:top w:type="dxa" w:w="70"/>
+              <w:left w:type="dxa" w:w="90"/>
+              <w:bottom w:type="dxa" w:w="70"/>
+              <w:right w:type="dxa" w:w="90"/>
+            </w:tcMar>
+          </w:tcPr>
+          <w:p>
+            <w:r>
+              <w:rPr>
+                <w:b/>
+                <w:bCs/>
+                <w:color w:val="FFFFFF"/>
+                <w:sz w:val="18"/>
+                <w:szCs w:val="18"/>
+              </w:rPr>
+              <w:t xml:space="preserve">Nội dung cập nhật</w:t>
+            </w:r>
+          </w:p>
+        </w:tc>
+        <w:tc>
+          <w:tcPr>
+            <w:tcW w:type="dxa" w:w="2200"/>
+            <w:shd w:fill="1F2A44" w:val="clear"/>
+            <w:tcMar>
+              <w:top w:type="dxa" w:w="70"/>
+              <w:left w:type="dxa" w:w="90"/>
+              <w:bottom w:type="dxa" w:w="70"/>
+              <w:right w:type="dxa" w:w="90"/>
+            </w:tcMar>
+          </w:tcPr>
+          <w:p>
+            <w:r>
+              <w:rPr>
+                <w:b/>
+                <w:bCs/>
+                <w:color w:val="FFFFFF"/>
+                <w:sz w:val="18"/>
+                <w:szCs w:val="18"/>
+              </w:rPr>
+              <w:t xml:space="preserve">Trạng thái</w:t>
+            </w:r>
+          </w:p>
+        </w:tc>
+      </w:tr>
+      <w:tr>
+        <w:tc>
+          <w:tcPr>
+            <w:tcW w:type="dxa" w:w="1200"/>
+            <w:tcMar>
+              <w:top w:type="dxa" w:w="70"/>
+              <w:left w:type="dxa" w:w="90"/>
+              <w:bottom w:type="dxa" w:w="70"/>
+              <w:right w:type="dxa" w:w="90"/>
+            </w:tcMar>
+          </w:tcPr>
+          <w:p>
+            <w:r>
+              <w:rPr>
+                <w:b w:val="false"/>
+                <w:bCs w:val="false"/>
+                <w:sz w:val="18"/>
+                <w:szCs w:val="18"/>
+              </w:rPr>
+              <w:t xml:space="preserve">S9-01</w:t>
+            </w:r>
+          </w:p>
+        </w:tc>
+        <w:tc>
+          <w:tcPr>
+            <w:tcW w:type="dxa" w:w="5600"/>
+            <w:tcMar>
+              <w:top w:type="dxa" w:w="70"/>
+              <w:left w:type="dxa" w:w="90"/>
+              <w:bottom w:type="dxa" w:w="70"/>
+              <w:right w:type="dxa" w:w="90"/>
+            </w:tcMar>
+          </w:tcPr>
+          <w:p>
+            <w:r>
+              <w:rPr>
+                <w:b w:val="false"/>
+                <w:bCs w:val="false"/>
+                <w:sz w:val="18"/>
+                <w:szCs w:val="18"/>
+              </w:rPr>
+              <w:t xml:space="preserve">Package crawler/ (Node.js/TypeScript, Crawlee BasicCrawler, cheerio, pg). Lệnh crawl và probe (xem trước một URL, không cần DB).</w:t>
+            </w:r>
+          </w:p>
+        </w:tc>
+        <w:tc>
+          <w:tcPr>
+            <w:tcW w:type="dxa" w:w="2200"/>
+            <w:tcMar>
+              <w:top w:type="dxa" w:w="70"/>
+              <w:left w:type="dxa" w:w="90"/>
+              <w:bottom w:type="dxa" w:w="70"/>
+              <w:right w:type="dxa" w:w="90"/>
+            </w:tcMar>
+          </w:tcPr>
+          <w:p>
+            <w:r>
+              <w:rPr>
+                <w:b w:val="false"/>
+                <w:bCs w:val="false"/>
+                <w:sz w:val="18"/>
+                <w:szCs w:val="18"/>
+              </w:rPr>
+              <w:t xml:space="preserve">Đã code + test tự động; chờ apply migration và tạo login role crawler</w:t>
+            </w:r>
+          </w:p>
+        </w:tc>
+      </w:tr>
+      <w:tr>
+        <w:tc>
+          <w:tcPr>
+            <w:tcW w:type="dxa" w:w="1200"/>
+            <w:tcMar>
+              <w:top w:type="dxa" w:w="70"/>
+              <w:left w:type="dxa" w:w="90"/>
+              <w:bottom w:type="dxa" w:w="70"/>
+              <w:right w:type="dxa" w:w="90"/>
+            </w:tcMar>
+          </w:tcPr>
+          <w:p>
+            <w:r>
+              <w:rPr>
+                <w:b w:val="false"/>
+                <w:bCs w:val="false"/>
+                <w:sz w:val="18"/>
+                <w:szCs w:val="18"/>
+              </w:rPr>
+              <w:t xml:space="preserve">S9-02</w:t>
+            </w:r>
+          </w:p>
+        </w:tc>
+        <w:tc>
+          <w:tcPr>
+            <w:tcW w:type="dxa" w:w="5600"/>
+            <w:tcMar>
+              <w:top w:type="dxa" w:w="70"/>
+              <w:left w:type="dxa" w:w="90"/>
+              <w:bottom w:type="dxa" w:w="70"/>
+              <w:right w:type="dxa" w:w="90"/>
+            </w:tcMar>
+          </w:tcPr>
+          <w:p>
+            <w:r>
+              <w:rPr>
+                <w:b w:val="false"/>
+                <w:bCs w:val="false"/>
+                <w:sz w:val="18"/>
+                <w:szCs w:val="18"/>
+              </w:rPr>
+              <w:t xml:space="preserve">robots.txt, 1 request mỗi lần, delay 5 giây theo domain, retry 2 lần khi 429/5xx/lỗi mạng, giới hạn kích thước/thời gian/loại nội dung, User-Agent trung thực.</w:t>
+            </w:r>
+          </w:p>
+        </w:tc>
+        <w:tc>
+          <w:tcPr>
+            <w:tcW w:type="dxa" w:w="2200"/>
+            <w:tcMar>
+              <w:top w:type="dxa" w:w="70"/>
+              <w:left w:type="dxa" w:w="90"/>
+              <w:bottom w:type="dxa" w:w="70"/>
+              <w:right w:type="dxa" w:w="90"/>
+            </w:tcMar>
+          </w:tcPr>
+          <w:p>
+            <w:r>
+              <w:rPr>
+                <w:b w:val="false"/>
+                <w:bCs w:val="false"/>
+                <w:sz w:val="18"/>
+                <w:szCs w:val="18"/>
+              </w:rPr>
+              <w:t xml:space="preserve">Đã code + test tự động; chờ apply migration và tạo login role crawler</w:t>
+            </w:r>
+          </w:p>
+        </w:tc>
+      </w:tr>
+      <w:tr>
+        <w:tc>
+          <w:tcPr>
+            <w:tcW w:type="dxa" w:w="1200"/>
+            <w:tcMar>
+              <w:top w:type="dxa" w:w="70"/>
+              <w:left w:type="dxa" w:w="90"/>
+              <w:bottom w:type="dxa" w:w="70"/>
+              <w:right w:type="dxa" w:w="90"/>
+            </w:tcMar>
+          </w:tcPr>
+          <w:p>
+            <w:r>
+              <w:rPr>
+                <w:b w:val="false"/>
+                <w:bCs w:val="false"/>
+                <w:sz w:val="18"/>
+                <w:szCs w:val="18"/>
+              </w:rPr>
+              <w:t xml:space="preserve">S9-03</w:t>
+            </w:r>
+          </w:p>
+        </w:tc>
+        <w:tc>
+          <w:tcPr>
+            <w:tcW w:type="dxa" w:w="5600"/>
+            <w:tcMar>
+              <w:top w:type="dxa" w:w="70"/>
+              <w:left w:type="dxa" w:w="90"/>
+              <w:bottom w:type="dxa" w:w="70"/>
+              <w:right w:type="dxa" w:w="90"/>
+            </w:tcMar>
+          </w:tcPr>
+          <w:p>
+            <w:r>
+              <w:rPr>
+                <w:b w:val="false"/>
+                <w:bCs w:val="false"/>
+                <w:sz w:val="18"/>
+                <w:szCs w:val="18"/>
+              </w:rPr>
+              <w:t xml:space="preserve">Thay đổi: không dùng service-role key. Ghi dữ liệu qua 5 hàm SQL bằng role nordic_crawler_ops (không có quyền trên bảng). Migration 20260928090000_crawler.</w:t>
+            </w:r>
+          </w:p>
+        </w:tc>
+        <w:tc>
+          <w:tcPr>
+            <w:tcW w:type="dxa" w:w="2200"/>
+            <w:tcMar>
+              <w:top w:type="dxa" w:w="70"/>
+              <w:left w:type="dxa" w:w="90"/>
+              <w:bottom w:type="dxa" w:w="70"/>
+              <w:right w:type="dxa" w:w="90"/>
+            </w:tcMar>
+          </w:tcPr>
+          <w:p>
+            <w:r>
+              <w:rPr>
+                <w:b w:val="false"/>
+                <w:bCs w:val="false"/>
+                <w:sz w:val="18"/>
+                <w:szCs w:val="18"/>
+              </w:rPr>
+              <w:t xml:space="preserve">Đã code + test tự động; chờ apply migration và tạo login role crawler</w:t>
+            </w:r>
+          </w:p>
+        </w:tc>
+      </w:tr>
+      <w:tr>
+        <w:tc>
+          <w:tcPr>
+            <w:tcW w:type="dxa" w:w="1200"/>
+            <w:tcMar>
+              <w:top w:type="dxa" w:w="70"/>
+              <w:left w:type="dxa" w:w="90"/>
+              <w:bottom w:type="dxa" w:w="70"/>
+              <w:right w:type="dxa" w:w="90"/>
+            </w:tcMar>
+          </w:tcPr>
+          <w:p>
+            <w:r>
+              <w:rPr>
+                <w:b w:val="false"/>
+                <w:bCs w:val="false"/>
+                <w:sz w:val="18"/>
+                <w:szCs w:val="18"/>
+              </w:rPr>
+              <w:t xml:space="preserve">S9-04</w:t>
+            </w:r>
+          </w:p>
+        </w:tc>
+        <w:tc>
+          <w:tcPr>
+            <w:tcW w:type="dxa" w:w="5600"/>
+            <w:tcMar>
+              <w:top w:type="dxa" w:w="70"/>
+              <w:left w:type="dxa" w:w="90"/>
+              <w:bottom w:type="dxa" w:w="70"/>
+              <w:right w:type="dxa" w:w="90"/>
+            </w:tcMar>
+          </w:tcPr>
+          <w:p>
+            <w:r>
+              <w:rPr>
+                <w:b w:val="false"/>
+                <w:bCs w:val="false"/>
+                <w:sz w:val="18"/>
+                <w:szCs w:val="18"/>
+              </w:rPr>
+              <w:t xml:space="preserve">Trạng thái incremental lưu trong bảng mới crawl_url_states (ETag, Last-Modified, hash, HTTP status) thay vì sources/documents; hash theo văn bản (sha256-text-v1).</w:t>
+            </w:r>
+          </w:p>
+        </w:tc>
+        <w:tc>
+          <w:tcPr>
+            <w:tcW w:type="dxa" w:w="2200"/>
+            <w:tcMar>
+              <w:top w:type="dxa" w:w="70"/>
+              <w:left w:type="dxa" w:w="90"/>
+              <w:bottom w:type="dxa" w:w="70"/>
+              <w:right w:type="dxa" w:w="90"/>
+            </w:tcMar>
+          </w:tcPr>
+          <w:p>
+            <w:r>
+              <w:rPr>
+                <w:b w:val="false"/>
+                <w:bCs w:val="false"/>
+                <w:sz w:val="18"/>
+                <w:szCs w:val="18"/>
+              </w:rPr>
+              <w:t xml:space="preserve">Đã code + test tự động; chờ apply migration và tạo login role crawler</w:t>
+            </w:r>
+          </w:p>
+        </w:tc>
+      </w:tr>
+      <w:tr>
+        <w:tc>
+          <w:tcPr>
+            <w:tcW w:type="dxa" w:w="1200"/>
+            <w:tcMar>
+              <w:top w:type="dxa" w:w="70"/>
+              <w:left w:type="dxa" w:w="90"/>
+              <w:bottom w:type="dxa" w:w="70"/>
+              <w:right w:type="dxa" w:w="90"/>
+            </w:tcMar>
+          </w:tcPr>
+          <w:p>
+            <w:r>
+              <w:rPr>
+                <w:b w:val="false"/>
+                <w:bCs w:val="false"/>
+                <w:sz w:val="18"/>
+                <w:szCs w:val="18"/>
+              </w:rPr>
+              <w:t xml:space="preserve">S9-05</w:t>
+            </w:r>
+          </w:p>
+        </w:tc>
+        <w:tc>
+          <w:tcPr>
+            <w:tcW w:type="dxa" w:w="5600"/>
+            <w:tcMar>
+              <w:top w:type="dxa" w:w="70"/>
+              <w:left w:type="dxa" w:w="90"/>
+              <w:bottom w:type="dxa" w:w="70"/>
+              <w:right w:type="dxa" w:w="90"/>
+            </w:tcMar>
+          </w:tcPr>
+          <w:p>
+            <w:r>
+              <w:rPr>
+                <w:b w:val="false"/>
+                <w:bCs w:val="false"/>
+                <w:sz w:val="18"/>
+                <w:szCs w:val="18"/>
+              </w:rPr>
+              <w:t xml:space="preserve">.github/workflows/crawler.yml: hằng tuần và chạy tay; secret CRAWLER_DATABASE_URL, biến tùy chọn CRAWLER_CONTACT_URL.</w:t>
+            </w:r>
+          </w:p>
+        </w:tc>
+        <w:tc>
+          <w:tcPr>
+            <w:tcW w:type="dxa" w:w="2200"/>
+            <w:tcMar>
+              <w:top w:type="dxa" w:w="70"/>
+              <w:left w:type="dxa" w:w="90"/>
+              <w:bottom w:type="dxa" w:w="70"/>
+              <w:right w:type="dxa" w:w="90"/>
+            </w:tcMar>
+          </w:tcPr>
+          <w:p>
+            <w:r>
+              <w:rPr>
+                <w:b w:val="false"/>
+                <w:bCs w:val="false"/>
+                <w:sz w:val="18"/>
+                <w:szCs w:val="18"/>
+              </w:rPr>
+              <w:t xml:space="preserve">Đã code + test tự động; chờ apply migration và tạo login role crawler</w:t>
+            </w:r>
+          </w:p>
+        </w:tc>
+      </w:tr>
+      <w:tr>
+        <w:tc>
+          <w:tcPr>
+            <w:tcW w:type="dxa" w:w="1200"/>
+            <w:tcMar>
+              <w:top w:type="dxa" w:w="70"/>
+              <w:left w:type="dxa" w:w="90"/>
+              <w:bottom w:type="dxa" w:w="70"/>
+              <w:right w:type="dxa" w:w="90"/>
+            </w:tcMar>
+          </w:tcPr>
+          <w:p>
+            <w:r>
+              <w:rPr>
+                <w:b w:val="false"/>
+                <w:bCs w:val="false"/>
+                <w:sz w:val="18"/>
+                <w:szCs w:val="18"/>
+              </w:rPr>
+              <w:t xml:space="preserve">S9-06</w:t>
+            </w:r>
+          </w:p>
+        </w:tc>
+        <w:tc>
+          <w:tcPr>
+            <w:tcW w:type="dxa" w:w="5600"/>
+            <w:tcMar>
+              <w:top w:type="dxa" w:w="70"/>
+              <w:left w:type="dxa" w:w="90"/>
+              <w:bottom w:type="dxa" w:w="70"/>
+              <w:right w:type="dxa" w:w="90"/>
+            </w:tcMar>
+          </w:tcPr>
+          <w:p>
+            <w:r>
+              <w:rPr>
+                <w:b w:val="false"/>
+                <w:bCs w:val="false"/>
+                <w:sz w:val="18"/>
+                <w:szCs w:val="18"/>
+              </w:rPr>
+              <w:t xml:space="preserve">Khi có phiên bản mới, gắn cờ thông tin đã duyệt có bằng chứng là phiên bản cũ; hàng chờ "Nguồn đã đổi" và cảnh báo trên thẻ thông tin; người duyệt chọn revalidated/rejected.</w:t>
+            </w:r>
+          </w:p>
+        </w:tc>
+        <w:tc>
+          <w:tcPr>
+            <w:tcW w:type="dxa" w:w="2200"/>
+            <w:tcMar>
+              <w:top w:type="dxa" w:w="70"/>
+              <w:left w:type="dxa" w:w="90"/>
+              <w:bottom w:type="dxa" w:w="70"/>
+              <w:right w:type="dxa" w:w="90"/>
+            </w:tcMar>
+          </w:tcPr>
+          <w:p>
+            <w:r>
+              <w:rPr>
+                <w:b w:val="false"/>
+                <w:bCs w:val="false"/>
+                <w:sz w:val="18"/>
+                <w:szCs w:val="18"/>
+              </w:rPr>
+              <w:t xml:space="preserve">Đã code + test tự động; chờ apply migration và tạo login role crawler</w:t>
+            </w:r>
+          </w:p>
+        </w:tc>
+      </w:tr>
+      <w:tr>
+        <w:tc>
+          <w:tcPr>
+            <w:tcW w:type="dxa" w:w="1200"/>
+            <w:tcMar>
+              <w:top w:type="dxa" w:w="70"/>
+              <w:left w:type="dxa" w:w="90"/>
+              <w:bottom w:type="dxa" w:w="70"/>
+              <w:right w:type="dxa" w:w="90"/>
+            </w:tcMar>
+          </w:tcPr>
+          <w:p>
+            <w:r>
+              <w:rPr>
+                <w:b w:val="false"/>
+                <w:bCs w:val="false"/>
+                <w:sz w:val="18"/>
+                <w:szCs w:val="18"/>
+              </w:rPr>
+              <w:t xml:space="preserve">S9-07</w:t>
+            </w:r>
+          </w:p>
+        </w:tc>
+        <w:tc>
+          <w:tcPr>
+            <w:tcW w:type="dxa" w:w="5600"/>
+            <w:tcMar>
+              <w:top w:type="dxa" w:w="70"/>
+              <w:left w:type="dxa" w:w="90"/>
+              <w:bottom w:type="dxa" w:w="70"/>
+              <w:right w:type="dxa" w:w="90"/>
+            </w:tcMar>
+          </w:tcPr>
+          <w:p>
+            <w:r>
+              <w:rPr>
+                <w:b w:val="false"/>
+                <w:bCs w:val="false"/>
+                <w:sz w:val="18"/>
+                <w:szCs w:val="18"/>
+              </w:rPr>
+              <w:t xml:space="preserve">crawler_runs + crawler_run_items: trạng thái, số lượng theo kết quả, HTTP status, mã lỗi, số thông tin bị gắn cờ; xem ở /admin/crawler.</w:t>
+            </w:r>
+          </w:p>
+        </w:tc>
+        <w:tc>
+          <w:tcPr>
+            <w:tcW w:type="dxa" w:w="2200"/>
+            <w:tcMar>
+              <w:top w:type="dxa" w:w="70"/>
+              <w:left w:type="dxa" w:w="90"/>
+              <w:bottom w:type="dxa" w:w="70"/>
+              <w:right w:type="dxa" w:w="90"/>
+            </w:tcMar>
+          </w:tcPr>
+          <w:p>
+            <w:r>
+              <w:rPr>
+                <w:b w:val="false"/>
+                <w:bCs w:val="false"/>
+                <w:sz w:val="18"/>
+                <w:szCs w:val="18"/>
+              </w:rPr>
+              <w:t xml:space="preserve">Đã code + test tự động; chờ apply migration và tạo login role crawler</w:t>
+            </w:r>
+          </w:p>
+        </w:tc>
+      </w:tr>
+      <w:tr>
+        <w:tc>
+          <w:tcPr>
+            <w:tcW w:type="dxa" w:w="1200"/>
+            <w:tcMar>
+              <w:top w:type="dxa" w:w="70"/>
+              <w:left w:type="dxa" w:w="90"/>
+              <w:bottom w:type="dxa" w:w="70"/>
+              <w:right w:type="dxa" w:w="90"/>
+            </w:tcMar>
+          </w:tcPr>
+          <w:p>
+            <w:r>
+              <w:rPr>
+                <w:b w:val="false"/>
+                <w:bCs w:val="false"/>
+                <w:sz w:val="18"/>
+                <w:szCs w:val="18"/>
+              </w:rPr>
+              <w:t xml:space="preserve">S9-08 (mới)</w:t>
+            </w:r>
+          </w:p>
+        </w:tc>
+        <w:tc>
+          <w:tcPr>
+            <w:tcW w:type="dxa" w:w="5600"/>
+            <w:tcMar>
+              <w:top w:type="dxa" w:w="70"/>
+              <w:left w:type="dxa" w:w="90"/>
+              <w:bottom w:type="dxa" w:w="70"/>
+              <w:right w:type="dxa" w:w="90"/>
+            </w:tcMar>
+          </w:tcPr>
+          <w:p>
+            <w:r>
+              <w:rPr>
+                <w:b w:val="false"/>
+                <w:bCs w:val="false"/>
+                <w:sz w:val="18"/>
+                <w:szCs w:val="18"/>
+              </w:rPr>
+              <w:t xml:space="preserve">/admin/crawler: đăng ký/sửa URL crawl (trang hoặc sitemap + tiền tố), hiển thị lý do nguồn chưa được crawl, kết quả gần nhất của từng URL.</w:t>
+            </w:r>
+          </w:p>
+        </w:tc>
+        <w:tc>
+          <w:tcPr>
+            <w:tcW w:type="dxa" w:w="2200"/>
+            <w:tcMar>
+              <w:top w:type="dxa" w:w="70"/>
+              <w:left w:type="dxa" w:w="90"/>
+              <w:bottom w:type="dxa" w:w="70"/>
+              <w:right w:type="dxa" w:w="90"/>
+            </w:tcMar>
+          </w:tcPr>
+          <w:p>
+            <w:r>
+              <w:rPr>
+                <w:b w:val="false"/>
+                <w:bCs w:val="false"/>
+                <w:sz w:val="18"/>
+                <w:szCs w:val="18"/>
+              </w:rPr>
+              <w:t xml:space="preserve">Đã code + test tự động; chờ apply migration và tạo login role crawler</w:t>
+            </w:r>
+          </w:p>
+        </w:tc>
+      </w:tr>
+      <w:tr>
+        <w:tc>
+          <w:tcPr>
+            <w:tcW w:type="dxa" w:w="1200"/>
+            <w:tcMar>
+              <w:top w:type="dxa" w:w="70"/>
+              <w:left w:type="dxa" w:w="90"/>
+              <w:bottom w:type="dxa" w:w="70"/>
+              <w:right w:type="dxa" w:w="90"/>
+            </w:tcMar>
+          </w:tcPr>
+          <w:p>
+            <w:r>
+              <w:rPr>
+                <w:b w:val="false"/>
+                <w:bCs w:val="false"/>
+                <w:sz w:val="18"/>
+                <w:szCs w:val="18"/>
+              </w:rPr>
+              <w:t xml:space="preserve">S9-09 (mới)</w:t>
+            </w:r>
+          </w:p>
+        </w:tc>
+        <w:tc>
+          <w:tcPr>
+            <w:tcW w:type="dxa" w:w="5600"/>
+            <w:tcMar>
+              <w:top w:type="dxa" w:w="70"/>
+              <w:left w:type="dxa" w:w="90"/>
+              <w:bottom w:type="dxa" w:w="70"/>
+              <w:right w:type="dxa" w:w="90"/>
+            </w:tcMar>
+          </w:tcPr>
+          <w:p>
+            <w:r>
+              <w:rPr>
+                <w:b w:val="false"/>
+                <w:bCs w:val="false"/>
+                <w:sz w:val="18"/>
+                <w:szCs w:val="18"/>
+              </w:rPr>
+              <w:t xml:space="preserve">Văn bản trích lưu nội bộ (document_texts), hiển thị trên trang tài liệu chỉ cho biên tập viên.</w:t>
+            </w:r>
+          </w:p>
+        </w:tc>
+        <w:tc>
+          <w:tcPr>
+            <w:tcW w:type="dxa" w:w="2200"/>
+            <w:tcMar>
+              <w:top w:type="dxa" w:w="70"/>
+              <w:left w:type="dxa" w:w="90"/>
+              <w:bottom w:type="dxa" w:w="70"/>
+              <w:right w:type="dxa" w:w="90"/>
+            </w:tcMar>
+          </w:tcPr>
+          <w:p>
+            <w:r>
+              <w:rPr>
+                <w:b w:val="false"/>
+                <w:bCs w:val="false"/>
+                <w:sz w:val="18"/>
+                <w:szCs w:val="18"/>
+              </w:rPr>
+              <w:t xml:space="preserve">Đã code + test tự động; chờ apply migration và tạo login role crawler</w:t>
             </w:r>
           </w:p>
         </w:tc>

</xml_diff>

<commit_message>
Add AI extraction of candidate facts (Slice 10a)
Editors request extraction for a crawled document; a separate extractor
worker (GitHub Actions, least-privilege nordic_extractor_ops role) sends
the stored page text to an OpenAI-compatible endpoint (first: Gemini free
tier) and hands every candidate to extractor_propose(), which validates it
in the database: excerpt verbatim in the page, every number grounded in
the excerpt, fixed topic list, known country, valid dates, no duplicates,
max 30 per document. Accepted candidates become proposed facts with
origin 'ai', attributed to a configured AI account that cannot review.

Adds /admin/extraction, a request panel on document pages, AI badges on
fact cards, the extractor workflow, docs, spec decision log and docx v0.8
update sections (additive only).

Co-Authored-By: Claude Opus 5.5 <noreply@anthropic.com>
</commit_message>
<xml_diff>
--- a/documents/Product_Backlog.docx
+++ b/documents/Product_Backlog.docx
@@ -11911,6 +11911,585 @@
                 <w:szCs w:val="18"/>
               </w:rPr>
               <w:t xml:space="preserve">Đã code + test tự động; chờ apply migration và tạo login role crawler</w:t>
+            </w:r>
+          </w:p>
+        </w:tc>
+      </w:tr>
+    </w:tbl>
+    <w:p>
+      <w:pPr>
+        <w:spacing w:after="120"/>
+      </w:pPr>
+      <w:r>
+        <w:t xml:space="preserve">Cập nhật v0.8 – 2026-09-28: Slice 10a (AI trích xuất thông tin ứng viên).</w:t>
+      </w:r>
+    </w:p>
+    <w:tbl>
+      <w:tblPr>
+        <w:tblW w:type="dxa" w:w="9000"/>
+        <w:tblBorders>
+          <w:top w:val="single" w:color="auto" w:sz="4"/>
+          <w:left w:val="single" w:color="auto" w:sz="4"/>
+          <w:bottom w:val="single" w:color="auto" w:sz="4"/>
+          <w:right w:val="single" w:color="auto" w:sz="4"/>
+          <w:insideH w:val="single" w:color="auto" w:sz="4"/>
+          <w:insideV w:val="single" w:color="auto" w:sz="4"/>
+        </w:tblBorders>
+      </w:tblPr>
+      <w:tblGrid>
+        <w:gridCol w:w="1200"/>
+        <w:gridCol w:w="5600"/>
+        <w:gridCol w:w="2200"/>
+      </w:tblGrid>
+      <w:tr>
+        <w:trPr>
+          <w:tblHeader/>
+        </w:trPr>
+        <w:tc>
+          <w:tcPr>
+            <w:tcW w:type="dxa" w:w="1200"/>
+            <w:shd w:fill="1F2A44" w:val="clear"/>
+            <w:tcMar>
+              <w:top w:type="dxa" w:w="70"/>
+              <w:left w:type="dxa" w:w="90"/>
+              <w:bottom w:type="dxa" w:w="70"/>
+              <w:right w:type="dxa" w:w="90"/>
+            </w:tcMar>
+          </w:tcPr>
+          <w:p>
+            <w:r>
+              <w:rPr>
+                <w:b/>
+                <w:bCs/>
+                <w:color w:val="FFFFFF"/>
+                <w:sz w:val="18"/>
+                <w:szCs w:val="18"/>
+              </w:rPr>
+              <w:t xml:space="preserve">Story ID</w:t>
+            </w:r>
+          </w:p>
+        </w:tc>
+        <w:tc>
+          <w:tcPr>
+            <w:tcW w:type="dxa" w:w="5600"/>
+            <w:shd w:fill="1F2A44" w:val="clear"/>
+            <w:tcMar>
+              <w:top w:type="dxa" w:w="70"/>
+              <w:left w:type="dxa" w:w="90"/>
+              <w:bottom w:type="dxa" w:w="70"/>
+              <w:right w:type="dxa" w:w="90"/>
+            </w:tcMar>
+          </w:tcPr>
+          <w:p>
+            <w:r>
+              <w:rPr>
+                <w:b/>
+                <w:bCs/>
+                <w:color w:val="FFFFFF"/>
+                <w:sz w:val="18"/>
+                <w:szCs w:val="18"/>
+              </w:rPr>
+              <w:t xml:space="preserve">Nội dung cập nhật</w:t>
+            </w:r>
+          </w:p>
+        </w:tc>
+        <w:tc>
+          <w:tcPr>
+            <w:tcW w:type="dxa" w:w="2200"/>
+            <w:shd w:fill="1F2A44" w:val="clear"/>
+            <w:tcMar>
+              <w:top w:type="dxa" w:w="70"/>
+              <w:left w:type="dxa" w:w="90"/>
+              <w:bottom w:type="dxa" w:w="70"/>
+              <w:right w:type="dxa" w:w="90"/>
+            </w:tcMar>
+          </w:tcPr>
+          <w:p>
+            <w:r>
+              <w:rPr>
+                <w:b/>
+                <w:bCs/>
+                <w:color w:val="FFFFFF"/>
+                <w:sz w:val="18"/>
+                <w:szCs w:val="18"/>
+              </w:rPr>
+              <w:t xml:space="preserve">Trạng thái</w:t>
+            </w:r>
+          </w:p>
+        </w:tc>
+      </w:tr>
+      <w:tr>
+        <w:tc>
+          <w:tcPr>
+            <w:tcW w:type="dxa" w:w="1200"/>
+            <w:tcMar>
+              <w:top w:type="dxa" w:w="70"/>
+              <w:left w:type="dxa" w:w="90"/>
+              <w:bottom w:type="dxa" w:w="70"/>
+              <w:right w:type="dxa" w:w="90"/>
+            </w:tcMar>
+          </w:tcPr>
+          <w:p>
+            <w:r>
+              <w:rPr>
+                <w:b w:val="false"/>
+                <w:bCs w:val="false"/>
+                <w:sz w:val="18"/>
+                <w:szCs w:val="18"/>
+              </w:rPr>
+              <w:t xml:space="preserve">S10-01</w:t>
+            </w:r>
+          </w:p>
+        </w:tc>
+        <w:tc>
+          <w:tcPr>
+            <w:tcW w:type="dxa" w:w="5600"/>
+            <w:tcMar>
+              <w:top w:type="dxa" w:w="70"/>
+              <w:left w:type="dxa" w:w="90"/>
+              <w:bottom w:type="dxa" w:w="70"/>
+              <w:right w:type="dxa" w:w="90"/>
+            </w:tcMar>
+          </w:tcPr>
+          <w:p>
+            <w:r>
+              <w:rPr>
+                <w:b w:val="false"/>
+                <w:bCs w:val="false"/>
+                <w:sz w:val="18"/>
+                <w:szCs w:val="18"/>
+              </w:rPr>
+              <w:t xml:space="preserve">Thay đổi thứ tự: chưa làm phân loại tài liệu. Đã tích hợp LLM qua endpoint tương thích OpenAI (Gemini free tier) trong worker extractor/.</w:t>
+            </w:r>
+          </w:p>
+        </w:tc>
+        <w:tc>
+          <w:tcPr>
+            <w:tcW w:type="dxa" w:w="2200"/>
+            <w:tcMar>
+              <w:top w:type="dxa" w:w="70"/>
+              <w:left w:type="dxa" w:w="90"/>
+              <w:bottom w:type="dxa" w:w="70"/>
+              <w:right w:type="dxa" w:w="90"/>
+            </w:tcMar>
+          </w:tcPr>
+          <w:p>
+            <w:r>
+              <w:rPr>
+                <w:b w:val="false"/>
+                <w:bCs w:val="false"/>
+                <w:sz w:val="18"/>
+                <w:szCs w:val="18"/>
+              </w:rPr>
+              <w:t xml:space="preserve">Đã code + test tự động; chờ apply migration, tạo login role và secret</w:t>
+            </w:r>
+          </w:p>
+        </w:tc>
+      </w:tr>
+      <w:tr>
+        <w:tc>
+          <w:tcPr>
+            <w:tcW w:type="dxa" w:w="1200"/>
+            <w:tcMar>
+              <w:top w:type="dxa" w:w="70"/>
+              <w:left w:type="dxa" w:w="90"/>
+              <w:bottom w:type="dxa" w:w="70"/>
+              <w:right w:type="dxa" w:w="90"/>
+            </w:tcMar>
+          </w:tcPr>
+          <w:p>
+            <w:r>
+              <w:rPr>
+                <w:b w:val="false"/>
+                <w:bCs w:val="false"/>
+                <w:sz w:val="18"/>
+                <w:szCs w:val="18"/>
+              </w:rPr>
+              <w:t xml:space="preserve">S10-02</w:t>
+            </w:r>
+          </w:p>
+        </w:tc>
+        <w:tc>
+          <w:tcPr>
+            <w:tcW w:type="dxa" w:w="5600"/>
+            <w:tcMar>
+              <w:top w:type="dxa" w:w="70"/>
+              <w:left w:type="dxa" w:w="90"/>
+              <w:bottom w:type="dxa" w:w="70"/>
+              <w:right w:type="dxa" w:w="90"/>
+            </w:tcMar>
+          </w:tcPr>
+          <w:p>
+            <w:r>
+              <w:rPr>
+                <w:b w:val="false"/>
+                <w:bCs w:val="false"/>
+                <w:sz w:val="18"/>
+                <w:szCs w:val="18"/>
+              </w:rPr>
+              <w:t xml:space="preserve">AI trích xuất thông tin ứng viên: luôn có bằng chứng nguyên văn, kiểm tra trong DB, chỉ tạo đề xuất. Migration 20260929090000_ai_extraction.</w:t>
+            </w:r>
+          </w:p>
+        </w:tc>
+        <w:tc>
+          <w:tcPr>
+            <w:tcW w:type="dxa" w:w="2200"/>
+            <w:tcMar>
+              <w:top w:type="dxa" w:w="70"/>
+              <w:left w:type="dxa" w:w="90"/>
+              <w:bottom w:type="dxa" w:w="70"/>
+              <w:right w:type="dxa" w:w="90"/>
+            </w:tcMar>
+          </w:tcPr>
+          <w:p>
+            <w:r>
+              <w:rPr>
+                <w:b w:val="false"/>
+                <w:bCs w:val="false"/>
+                <w:sz w:val="18"/>
+                <w:szCs w:val="18"/>
+              </w:rPr>
+              <w:t xml:space="preserve">Đã code + test tự động; chờ apply migration, tạo login role và secret</w:t>
+            </w:r>
+          </w:p>
+        </w:tc>
+      </w:tr>
+      <w:tr>
+        <w:tc>
+          <w:tcPr>
+            <w:tcW w:type="dxa" w:w="1200"/>
+            <w:tcMar>
+              <w:top w:type="dxa" w:w="70"/>
+              <w:left w:type="dxa" w:w="90"/>
+              <w:bottom w:type="dxa" w:w="70"/>
+              <w:right w:type="dxa" w:w="90"/>
+            </w:tcMar>
+          </w:tcPr>
+          <w:p>
+            <w:r>
+              <w:rPr>
+                <w:b w:val="false"/>
+                <w:bCs w:val="false"/>
+                <w:sz w:val="18"/>
+                <w:szCs w:val="18"/>
+              </w:rPr>
+              <w:t xml:space="preserve">S10-03</w:t>
+            </w:r>
+          </w:p>
+        </w:tc>
+        <w:tc>
+          <w:tcPr>
+            <w:tcW w:type="dxa" w:w="5600"/>
+            <w:tcMar>
+              <w:top w:type="dxa" w:w="70"/>
+              <w:left w:type="dxa" w:w="90"/>
+              <w:bottom w:type="dxa" w:w="70"/>
+              <w:right w:type="dxa" w:w="90"/>
+            </w:tcMar>
+          </w:tcPr>
+          <w:p>
+            <w:r>
+              <w:rPr>
+                <w:b w:val="false"/>
+                <w:bCs w:val="false"/>
+                <w:sz w:val="18"/>
+                <w:szCs w:val="18"/>
+              </w:rPr>
+              <w:t xml:space="preserve">Chưa làm – dời sang Slice 10b (pgvector, embedding).</w:t>
+            </w:r>
+          </w:p>
+        </w:tc>
+        <w:tc>
+          <w:tcPr>
+            <w:tcW w:type="dxa" w:w="2200"/>
+            <w:tcMar>
+              <w:top w:type="dxa" w:w="70"/>
+              <w:left w:type="dxa" w:w="90"/>
+              <w:bottom w:type="dxa" w:w="70"/>
+              <w:right w:type="dxa" w:w="90"/>
+            </w:tcMar>
+          </w:tcPr>
+          <w:p>
+            <w:r>
+              <w:rPr>
+                <w:b w:val="false"/>
+                <w:bCs w:val="false"/>
+                <w:sz w:val="18"/>
+                <w:szCs w:val="18"/>
+              </w:rPr>
+              <w:t xml:space="preserve">Chưa bắt đầu</w:t>
+            </w:r>
+          </w:p>
+        </w:tc>
+      </w:tr>
+      <w:tr>
+        <w:tc>
+          <w:tcPr>
+            <w:tcW w:type="dxa" w:w="1200"/>
+            <w:tcMar>
+              <w:top w:type="dxa" w:w="70"/>
+              <w:left w:type="dxa" w:w="90"/>
+              <w:bottom w:type="dxa" w:w="70"/>
+              <w:right w:type="dxa" w:w="90"/>
+            </w:tcMar>
+          </w:tcPr>
+          <w:p>
+            <w:r>
+              <w:rPr>
+                <w:b w:val="false"/>
+                <w:bCs w:val="false"/>
+                <w:sz w:val="18"/>
+                <w:szCs w:val="18"/>
+              </w:rPr>
+              <w:t xml:space="preserve">S10-04</w:t>
+            </w:r>
+          </w:p>
+        </w:tc>
+        <w:tc>
+          <w:tcPr>
+            <w:tcW w:type="dxa" w:w="5600"/>
+            <w:tcMar>
+              <w:top w:type="dxa" w:w="70"/>
+              <w:left w:type="dxa" w:w="90"/>
+              <w:bottom w:type="dxa" w:w="70"/>
+              <w:right w:type="dxa" w:w="90"/>
+            </w:tcMar>
+          </w:tcPr>
+          <w:p>
+            <w:r>
+              <w:rPr>
+                <w:b w:val="false"/>
+                <w:bCs w:val="false"/>
+                <w:sz w:val="18"/>
+                <w:szCs w:val="18"/>
+              </w:rPr>
+              <w:t xml:space="preserve">Chưa làm – dời sang Slice 10b (semantic/hybrid search).</w:t>
+            </w:r>
+          </w:p>
+        </w:tc>
+        <w:tc>
+          <w:tcPr>
+            <w:tcW w:type="dxa" w:w="2200"/>
+            <w:tcMar>
+              <w:top w:type="dxa" w:w="70"/>
+              <w:left w:type="dxa" w:w="90"/>
+              <w:bottom w:type="dxa" w:w="70"/>
+              <w:right w:type="dxa" w:w="90"/>
+            </w:tcMar>
+          </w:tcPr>
+          <w:p>
+            <w:r>
+              <w:rPr>
+                <w:b w:val="false"/>
+                <w:bCs w:val="false"/>
+                <w:sz w:val="18"/>
+                <w:szCs w:val="18"/>
+              </w:rPr>
+              <w:t xml:space="preserve">Chưa bắt đầu</w:t>
+            </w:r>
+          </w:p>
+        </w:tc>
+      </w:tr>
+      <w:tr>
+        <w:tc>
+          <w:tcPr>
+            <w:tcW w:type="dxa" w:w="1200"/>
+            <w:tcMar>
+              <w:top w:type="dxa" w:w="70"/>
+              <w:left w:type="dxa" w:w="90"/>
+              <w:bottom w:type="dxa" w:w="70"/>
+              <w:right w:type="dxa" w:w="90"/>
+            </w:tcMar>
+          </w:tcPr>
+          <w:p>
+            <w:r>
+              <w:rPr>
+                <w:b w:val="false"/>
+                <w:bCs w:val="false"/>
+                <w:sz w:val="18"/>
+                <w:szCs w:val="18"/>
+              </w:rPr>
+              <w:t xml:space="preserve">S10-05</w:t>
+            </w:r>
+          </w:p>
+        </w:tc>
+        <w:tc>
+          <w:tcPr>
+            <w:tcW w:type="dxa" w:w="5600"/>
+            <w:tcMar>
+              <w:top w:type="dxa" w:w="70"/>
+              <w:left w:type="dxa" w:w="90"/>
+              <w:bottom w:type="dxa" w:w="70"/>
+              <w:right w:type="dxa" w:w="90"/>
+            </w:tcMar>
+          </w:tcPr>
+          <w:p>
+            <w:r>
+              <w:rPr>
+                <w:b w:val="false"/>
+                <w:bCs w:val="false"/>
+                <w:sz w:val="18"/>
+                <w:szCs w:val="18"/>
+              </w:rPr>
+              <w:t xml:space="preserve">AI không gắn nhãn chính thức, không đánh dấu mâu thuẫn, không duyệt: chỉ tạo proposed; tài khoản AI không có facts.review.</w:t>
+            </w:r>
+          </w:p>
+        </w:tc>
+        <w:tc>
+          <w:tcPr>
+            <w:tcW w:type="dxa" w:w="2200"/>
+            <w:tcMar>
+              <w:top w:type="dxa" w:w="70"/>
+              <w:left w:type="dxa" w:w="90"/>
+              <w:bottom w:type="dxa" w:w="70"/>
+              <w:right w:type="dxa" w:w="90"/>
+            </w:tcMar>
+          </w:tcPr>
+          <w:p>
+            <w:r>
+              <w:rPr>
+                <w:b w:val="false"/>
+                <w:bCs w:val="false"/>
+                <w:sz w:val="18"/>
+                <w:szCs w:val="18"/>
+              </w:rPr>
+              <w:t xml:space="preserve">Đã code + test tự động; chờ apply migration, tạo login role và secret</w:t>
+            </w:r>
+          </w:p>
+        </w:tc>
+      </w:tr>
+      <w:tr>
+        <w:tc>
+          <w:tcPr>
+            <w:tcW w:type="dxa" w:w="1200"/>
+            <w:tcMar>
+              <w:top w:type="dxa" w:w="70"/>
+              <w:left w:type="dxa" w:w="90"/>
+              <w:bottom w:type="dxa" w:w="70"/>
+              <w:right w:type="dxa" w:w="90"/>
+            </w:tcMar>
+          </w:tcPr>
+          <w:p>
+            <w:r>
+              <w:rPr>
+                <w:b w:val="false"/>
+                <w:bCs w:val="false"/>
+                <w:sz w:val="18"/>
+                <w:szCs w:val="18"/>
+              </w:rPr>
+              <w:t xml:space="preserve">S10-06 (mới)</w:t>
+            </w:r>
+          </w:p>
+        </w:tc>
+        <w:tc>
+          <w:tcPr>
+            <w:tcW w:type="dxa" w:w="5600"/>
+            <w:tcMar>
+              <w:top w:type="dxa" w:w="70"/>
+              <w:left w:type="dxa" w:w="90"/>
+              <w:bottom w:type="dxa" w:w="70"/>
+              <w:right w:type="dxa" w:w="90"/>
+            </w:tcMar>
+          </w:tcPr>
+          <w:p>
+            <w:r>
+              <w:rPr>
+                <w:b w:val="false"/>
+                <w:bCs w:val="false"/>
+                <w:sz w:val="18"/>
+                <w:szCs w:val="18"/>
+              </w:rPr>
+              <w:t xml:space="preserve">Yêu cầu/hủy trích xuất trên trang tài liệu; trang /admin/extraction (tài khoản AI, yêu cầu đang mở, lần chạy, lý do loại).</w:t>
+            </w:r>
+          </w:p>
+        </w:tc>
+        <w:tc>
+          <w:tcPr>
+            <w:tcW w:type="dxa" w:w="2200"/>
+            <w:tcMar>
+              <w:top w:type="dxa" w:w="70"/>
+              <w:left w:type="dxa" w:w="90"/>
+              <w:bottom w:type="dxa" w:w="70"/>
+              <w:right w:type="dxa" w:w="90"/>
+            </w:tcMar>
+          </w:tcPr>
+          <w:p>
+            <w:r>
+              <w:rPr>
+                <w:b w:val="false"/>
+                <w:bCs w:val="false"/>
+                <w:sz w:val="18"/>
+                <w:szCs w:val="18"/>
+              </w:rPr>
+              <w:t xml:space="preserve">Đã code + test tự động; chờ apply migration, tạo login role và secret</w:t>
+            </w:r>
+          </w:p>
+        </w:tc>
+      </w:tr>
+      <w:tr>
+        <w:tc>
+          <w:tcPr>
+            <w:tcW w:type="dxa" w:w="1200"/>
+            <w:tcMar>
+              <w:top w:type="dxa" w:w="70"/>
+              <w:left w:type="dxa" w:w="90"/>
+              <w:bottom w:type="dxa" w:w="70"/>
+              <w:right w:type="dxa" w:w="90"/>
+            </w:tcMar>
+          </w:tcPr>
+          <w:p>
+            <w:r>
+              <w:rPr>
+                <w:b w:val="false"/>
+                <w:bCs w:val="false"/>
+                <w:sz w:val="18"/>
+                <w:szCs w:val="18"/>
+              </w:rPr>
+              <w:t xml:space="preserve">S10-07 (mới)</w:t>
+            </w:r>
+          </w:p>
+        </w:tc>
+        <w:tc>
+          <w:tcPr>
+            <w:tcW w:type="dxa" w:w="5600"/>
+            <w:tcMar>
+              <w:top w:type="dxa" w:w="70"/>
+              <w:left w:type="dxa" w:w="90"/>
+              <w:bottom w:type="dxa" w:w="70"/>
+              <w:right w:type="dxa" w:w="90"/>
+            </w:tcMar>
+          </w:tcPr>
+          <w:p>
+            <w:r>
+              <w:rPr>
+                <w:b w:val="false"/>
+                <w:bCs w:val="false"/>
+                <w:sz w:val="18"/>
+                <w:szCs w:val="18"/>
+              </w:rPr>
+              <w:t xml:space="preserve">Badge "Đề xuất bởi AI" và độ tự tin do mô hình tự đánh giá trên thẻ thông tin; workflow extractor.yml.</w:t>
+            </w:r>
+          </w:p>
+        </w:tc>
+        <w:tc>
+          <w:tcPr>
+            <w:tcW w:type="dxa" w:w="2200"/>
+            <w:tcMar>
+              <w:top w:type="dxa" w:w="70"/>
+              <w:left w:type="dxa" w:w="90"/>
+              <w:bottom w:type="dxa" w:w="70"/>
+              <w:right w:type="dxa" w:w="90"/>
+            </w:tcMar>
+          </w:tcPr>
+          <w:p>
+            <w:r>
+              <w:rPr>
+                <w:b w:val="false"/>
+                <w:bCs w:val="false"/>
+                <w:sz w:val="18"/>
+                <w:szCs w:val="18"/>
+              </w:rPr>
+              <w:t xml:space="preserve">Đã code + test tự động; chờ apply migration, tạo login role và secret</w:t>
             </w:r>
           </w:p>
         </w:tc>

</xml_diff>